<commit_message>
Update report with direction-inconsistent misclassification finding; move CSV outputs to logs/
</commit_message>
<xml_diff>
--- a/reports/Draft_Report.docx
+++ b/reports/Draft_Report.docx
@@ -1066,6 +1066,14 @@
         <w:t xml:space="preserve">A second, fully live end-to-end run was then carried out with the mic-recording and interactive-chat additions in place: a real spoken response was recorded via recorder.py, transcribed, classified, and used to generate a profile, after which several follow-up questions were exchanged through run_chat_loop(). This confirmed that live microphone input, the full four-stage pipeline, and the interactive chat all work together correctly. See Evaluation, Stage 4 results, for a limitation identified during this test.</w:t>
       </w:r>
     </w:p>
+    <w:p>
+      <w:pPr>
+        <w:pStyle w:val="BodyText"/>
+      </w:pPr>
+      <w:r>
+        <w:t xml:space="preserve">Following the OASIS and picture-in-picture integration described earlier in this chapter, a first fully real end-to-end run was carried out: real consent, the real OASIS stimulus sequence, a live microphone recording for each spoken question, and an interactive chat exchange, run via pipeline.py with no --demo flag and no placeholder content anywhere in the chain. The session completed and logged correctly, confirming the full guided flow works as designed outside of demo mode. This run was a pipeline smoke test rather than a genuine reflective session (the spoken answers were not considered), so its content is not treated as evaluation data in this chapter.</w:t>
+      </w:r>
+    </w:p>
     <w:bookmarkEnd w:id="45"/>
     <w:bookmarkEnd w:id="46"/>
     <w:bookmarkStart w:id="47" w:name="session-flow-and-user-interaction"/>
@@ -1226,7 +1234,1487 @@
         <w:pStyle w:val="BodyText"/>
       </w:pPr>
       <w:r>
-        <w:t xml:space="preserve">A subsequent full-session run through the completed guided flow produced a sharper version of the same problem. Across all four scenes, every reading returned the same dominant emotion (sad: 10, 15, 15 and 12 readings for the threatening, joyful, sad and relaxing scenes respectively), with no variation between scenes that were designed to provoke markedly different responses. Unlike the earlier test, this run involved no deliberately expressed emotions, so it represents the resting-face condition specifically, and it indicates that the model's behaviour on an unperforming face is not merely noisy but can be uniformly wrong in a single direction. This has a direct consequence for the system as a whole: the language stage receives a per-scene summary it treats as meaningful, and cannot distinguish a genuine emotional pattern from a constant misclassification, so a uniformly incorrect vision stage propagates silently into a confident-sounding profile.</w:t>
+        <w:t xml:space="preserve">A subsequent full-session run through the completed guided flow produced a sharper version of the same problem. Across all four scenes, every reading returned the same dominant emotion (sad: 10, 15, 15 and 12 readings for the threatening, joyful, sad and relaxing scenes respectively), with no variation between scenes that were designed to provoke markedly different responses. Unlike the earlier test, this run involved no deliberately expressed emotions, so it represents the resting-face condition specifically, and at the time indicated the model's behaviour on an unperforming face could be uniformly wrong in a single direction - a reading later complicated by a further run (below). This has a direct consequence for the system as a whole: the language stage receives a per-scene summary it treats as meaningful, and cannot distinguish a genuine emotional pattern from a constant misclassification, so a uniformly incorrect vision stage propagates silently into a confident-sounding profile.</w:t>
+      </w:r>
+    </w:p>
+    <w:p>
+      <w:pPr>
+        <w:pStyle w:val="BodyText"/>
+      </w:pPr>
+      <w:r>
+        <w:t xml:space="preserve">A later run with the real OASIS stimulus in place complicates this picture rather than confirming it: the sad scene was dominantly misread as happy, the opposite direction from the sad/fear over-detection seen in the two runs above, while the other three scenes read as neutral. Taken together, the misclassification does not consistently favour negative emotion as first thought; it is direction-inconsistent, which if anything is a more serious problem for the profile-generation stage than a predictable bias would be, since a consistent error could in principle be corrected for, whereas an inconsistent one cannot.</w:t>
+      </w:r>
+    </w:p>
+    <w:p>
+      <w:pPr>
+        <w:pStyle w:val="Heading3"/>
+      </w:pPr>
+      <w:r>
+        <w:t xml:space="preserve">DeepFace vs. FER comparison</w:t>
+      </w:r>
+    </w:p>
+    <w:p>
+      <w:pPr>
+        <w:pStyle w:val="BodyText"/>
+      </w:pPr>
+      <w:r>
+        <w:t xml:space="preserve">DeepFace was benchmarked against FER (a separate Keras CNN emotion model with, by default, a Haar Cascade face detector rather than DeepFace's) using emotion_benchmark.py, sampling one frame per second through both models simultaneously from a live webcam feed. Two runs were carried out.</w:t>
+      </w:r>
+    </w:p>
+    <w:p>
+      <w:pPr>
+        <w:pStyle w:val="BodyText"/>
+      </w:pPr>
+      <w:r>
+        <w:t xml:space="preserve">The first run was not tightly controlled for camera framing (the participant was not consistently facing the camera throughout). Table 4 shows the result: FER failed to detect a face on 7 of 12 sampled frames, against zero missed detections for DeepFace, while both models agreed on every frame where FER did detect a face. This is not treated as a reliable finding about the two models' relative robustness, since it may reflect FER's detector being more sensitive to off-centre framing rather than a genuine reliability gap; it is reported for completeness rather than acted on.</w:t>
+      </w:r>
+    </w:p>
+    <w:tbl>
+      <w:tblPr>
+        <w:tblStyle w:val="Table"/>
+        <w:tblW w:type="pct" w:w="5000"/>
+        <w:tblLook w:firstRow="1" w:lastRow="0" w:firstColumn="0" w:lastColumn="0" w:noHBand="0" w:noVBand="0" w:val="0020"/>
+        <w:jc w:val="start"/>
+      </w:tblPr>
+      <w:tblGrid>
+        <w:gridCol w:w="2362"/>
+        <w:gridCol w:w="2362"/>
+        <w:gridCol w:w="2362"/>
+        <w:gridCol w:w="2362"/>
+      </w:tblGrid>
+      <w:tr>
+        <w:trPr>
+          <w:tblHeader w:val="true"/>
+        </w:trPr>
+        <w:tc>
+          <w:tcPr/>
+          <w:p>
+            <w:pPr>
+              <w:pStyle w:val="Compact"/>
+              <w:jc w:val="left"/>
+            </w:pPr>
+            <w:r>
+              <w:rPr>
+                <w:bCs/>
+                <w:b/>
+              </w:rPr>
+              <w:t xml:space="preserve">Elapsed (s)</w:t>
+            </w:r>
+          </w:p>
+        </w:tc>
+        <w:tc>
+          <w:tcPr/>
+          <w:p>
+            <w:pPr>
+              <w:pStyle w:val="Compact"/>
+              <w:jc w:val="left"/>
+            </w:pPr>
+            <w:r>
+              <w:rPr>
+                <w:bCs/>
+                <w:b/>
+              </w:rPr>
+              <w:t xml:space="preserve">DeepFace label (latency)</w:t>
+            </w:r>
+          </w:p>
+        </w:tc>
+        <w:tc>
+          <w:tcPr/>
+          <w:p>
+            <w:pPr>
+              <w:pStyle w:val="Compact"/>
+              <w:jc w:val="left"/>
+            </w:pPr>
+            <w:r>
+              <w:rPr>
+                <w:bCs/>
+                <w:b/>
+              </w:rPr>
+              <w:t xml:space="preserve">FER label (latency)</w:t>
+            </w:r>
+          </w:p>
+        </w:tc>
+        <w:tc>
+          <w:tcPr/>
+          <w:p>
+            <w:pPr>
+              <w:pStyle w:val="Compact"/>
+              <w:jc w:val="left"/>
+            </w:pPr>
+            <w:r>
+              <w:rPr>
+                <w:bCs/>
+                <w:b/>
+              </w:rPr>
+              <w:t xml:space="preserve">Agreement</w:t>
+            </w:r>
+          </w:p>
+        </w:tc>
+      </w:tr>
+      <w:tr>
+        <w:tc>
+          <w:tcPr/>
+          <w:p>
+            <w:pPr>
+              <w:pStyle w:val="Compact"/>
+              <w:jc w:val="left"/>
+            </w:pPr>
+            <w:r>
+              <w:t xml:space="preserve">1.0</w:t>
+            </w:r>
+          </w:p>
+        </w:tc>
+        <w:tc>
+          <w:tcPr/>
+          <w:p>
+            <w:pPr>
+              <w:pStyle w:val="Compact"/>
+              <w:jc w:val="left"/>
+            </w:pPr>
+            <w:r>
+              <w:t xml:space="preserve">happy (425.3ms)</w:t>
+            </w:r>
+          </w:p>
+        </w:tc>
+        <w:tc>
+          <w:tcPr/>
+          <w:p>
+            <w:pPr>
+              <w:pStyle w:val="Compact"/>
+              <w:jc w:val="left"/>
+            </w:pPr>
+            <w:r>
+              <w:t xml:space="preserve">no face detected (14.1ms)</w:t>
+            </w:r>
+          </w:p>
+        </w:tc>
+        <w:tc>
+          <w:tcPr/>
+          <w:p>
+            <w:pPr>
+              <w:pStyle w:val="Compact"/>
+              <w:jc w:val="left"/>
+            </w:pPr>
+            <w:r>
+              <w:t xml:space="preserve">-</w:t>
+            </w:r>
+          </w:p>
+        </w:tc>
+      </w:tr>
+      <w:tr>
+        <w:tc>
+          <w:tcPr/>
+          <w:p>
+            <w:pPr>
+              <w:pStyle w:val="Compact"/>
+              <w:jc w:val="left"/>
+            </w:pPr>
+            <w:r>
+              <w:t xml:space="preserve">4.0</w:t>
+            </w:r>
+          </w:p>
+        </w:tc>
+        <w:tc>
+          <w:tcPr/>
+          <w:p>
+            <w:pPr>
+              <w:pStyle w:val="Compact"/>
+              <w:jc w:val="left"/>
+            </w:pPr>
+            <w:r>
+              <w:t xml:space="preserve">happy (70.5ms)</w:t>
+            </w:r>
+          </w:p>
+        </w:tc>
+        <w:tc>
+          <w:tcPr/>
+          <w:p>
+            <w:pPr>
+              <w:pStyle w:val="Compact"/>
+              <w:jc w:val="left"/>
+            </w:pPr>
+            <w:r>
+              <w:t xml:space="preserve">no face detected (13.3ms)</w:t>
+            </w:r>
+          </w:p>
+        </w:tc>
+        <w:tc>
+          <w:tcPr/>
+          <w:p>
+            <w:pPr>
+              <w:pStyle w:val="Compact"/>
+              <w:jc w:val="left"/>
+            </w:pPr>
+            <w:r>
+              <w:t xml:space="preserve">-</w:t>
+            </w:r>
+          </w:p>
+        </w:tc>
+      </w:tr>
+      <w:tr>
+        <w:tc>
+          <w:tcPr/>
+          <w:p>
+            <w:pPr>
+              <w:pStyle w:val="Compact"/>
+              <w:jc w:val="left"/>
+            </w:pPr>
+            <w:r>
+              <w:t xml:space="preserve">5.0</w:t>
+            </w:r>
+          </w:p>
+        </w:tc>
+        <w:tc>
+          <w:tcPr/>
+          <w:p>
+            <w:pPr>
+              <w:pStyle w:val="Compact"/>
+              <w:jc w:val="left"/>
+            </w:pPr>
+            <w:r>
+              <w:t xml:space="preserve">happy (69.7ms)</w:t>
+            </w:r>
+          </w:p>
+        </w:tc>
+        <w:tc>
+          <w:tcPr/>
+          <w:p>
+            <w:pPr>
+              <w:pStyle w:val="Compact"/>
+              <w:jc w:val="left"/>
+            </w:pPr>
+            <w:r>
+              <w:t xml:space="preserve">no face detected (13.2ms)</w:t>
+            </w:r>
+          </w:p>
+        </w:tc>
+        <w:tc>
+          <w:tcPr/>
+          <w:p>
+            <w:pPr>
+              <w:pStyle w:val="Compact"/>
+              <w:jc w:val="left"/>
+            </w:pPr>
+            <w:r>
+              <w:t xml:space="preserve">-</w:t>
+            </w:r>
+          </w:p>
+        </w:tc>
+      </w:tr>
+      <w:tr>
+        <w:tc>
+          <w:tcPr/>
+          <w:p>
+            <w:pPr>
+              <w:pStyle w:val="Compact"/>
+              <w:jc w:val="left"/>
+            </w:pPr>
+            <w:r>
+              <w:t xml:space="preserve">6.1</w:t>
+            </w:r>
+          </w:p>
+        </w:tc>
+        <w:tc>
+          <w:tcPr/>
+          <w:p>
+            <w:pPr>
+              <w:pStyle w:val="Compact"/>
+              <w:jc w:val="left"/>
+            </w:pPr>
+            <w:r>
+              <w:t xml:space="preserve">happy (65.1ms)</w:t>
+            </w:r>
+          </w:p>
+        </w:tc>
+        <w:tc>
+          <w:tcPr/>
+          <w:p>
+            <w:pPr>
+              <w:pStyle w:val="Compact"/>
+              <w:jc w:val="left"/>
+            </w:pPr>
+            <w:r>
+              <w:t xml:space="preserve">no face detected (13.2ms)</w:t>
+            </w:r>
+          </w:p>
+        </w:tc>
+        <w:tc>
+          <w:tcPr/>
+          <w:p>
+            <w:pPr>
+              <w:pStyle w:val="Compact"/>
+              <w:jc w:val="left"/>
+            </w:pPr>
+            <w:r>
+              <w:t xml:space="preserve">-</w:t>
+            </w:r>
+          </w:p>
+        </w:tc>
+      </w:tr>
+      <w:tr>
+        <w:tc>
+          <w:tcPr/>
+          <w:p>
+            <w:pPr>
+              <w:pStyle w:val="Compact"/>
+              <w:jc w:val="left"/>
+            </w:pPr>
+            <w:r>
+              <w:t xml:space="preserve">7.1</w:t>
+            </w:r>
+          </w:p>
+        </w:tc>
+        <w:tc>
+          <w:tcPr/>
+          <w:p>
+            <w:pPr>
+              <w:pStyle w:val="Compact"/>
+              <w:jc w:val="left"/>
+            </w:pPr>
+            <w:r>
+              <w:t xml:space="preserve">happy (63.6ms)</w:t>
+            </w:r>
+          </w:p>
+        </w:tc>
+        <w:tc>
+          <w:tcPr/>
+          <w:p>
+            <w:pPr>
+              <w:pStyle w:val="Compact"/>
+              <w:jc w:val="left"/>
+            </w:pPr>
+            <w:r>
+              <w:t xml:space="preserve">no face detected (13.2ms)</w:t>
+            </w:r>
+          </w:p>
+        </w:tc>
+        <w:tc>
+          <w:tcPr/>
+          <w:p>
+            <w:pPr>
+              <w:pStyle w:val="Compact"/>
+              <w:jc w:val="left"/>
+            </w:pPr>
+            <w:r>
+              <w:t xml:space="preserve">-</w:t>
+            </w:r>
+          </w:p>
+        </w:tc>
+      </w:tr>
+      <w:tr>
+        <w:tc>
+          <w:tcPr/>
+          <w:p>
+            <w:pPr>
+              <w:pStyle w:val="Compact"/>
+              <w:jc w:val="left"/>
+            </w:pPr>
+            <w:r>
+              <w:t xml:space="preserve">8.1</w:t>
+            </w:r>
+          </w:p>
+        </w:tc>
+        <w:tc>
+          <w:tcPr/>
+          <w:p>
+            <w:pPr>
+              <w:pStyle w:val="Compact"/>
+              <w:jc w:val="left"/>
+            </w:pPr>
+            <w:r>
+              <w:t xml:space="preserve">happy (72.3ms)</w:t>
+            </w:r>
+          </w:p>
+        </w:tc>
+        <w:tc>
+          <w:tcPr/>
+          <w:p>
+            <w:pPr>
+              <w:pStyle w:val="Compact"/>
+              <w:jc w:val="left"/>
+            </w:pPr>
+            <w:r>
+              <w:t xml:space="preserve">no face detected (11.1ms)</w:t>
+            </w:r>
+          </w:p>
+        </w:tc>
+        <w:tc>
+          <w:tcPr/>
+          <w:p>
+            <w:pPr>
+              <w:pStyle w:val="Compact"/>
+              <w:jc w:val="left"/>
+            </w:pPr>
+            <w:r>
+              <w:t xml:space="preserve">-</w:t>
+            </w:r>
+          </w:p>
+        </w:tc>
+      </w:tr>
+      <w:tr>
+        <w:tc>
+          <w:tcPr/>
+          <w:p>
+            <w:pPr>
+              <w:pStyle w:val="Compact"/>
+              <w:jc w:val="left"/>
+            </w:pPr>
+            <w:r>
+              <w:t xml:space="preserve">9.1</w:t>
+            </w:r>
+          </w:p>
+        </w:tc>
+        <w:tc>
+          <w:tcPr/>
+          <w:p>
+            <w:pPr>
+              <w:pStyle w:val="Compact"/>
+              <w:jc w:val="left"/>
+            </w:pPr>
+            <w:r>
+              <w:t xml:space="preserve">neutral (68.7ms)</w:t>
+            </w:r>
+          </w:p>
+        </w:tc>
+        <w:tc>
+          <w:tcPr/>
+          <w:p>
+            <w:pPr>
+              <w:pStyle w:val="Compact"/>
+              <w:jc w:val="left"/>
+            </w:pPr>
+            <w:r>
+              <w:t xml:space="preserve">neutral (17.1ms)</w:t>
+            </w:r>
+          </w:p>
+        </w:tc>
+        <w:tc>
+          <w:tcPr/>
+          <w:p>
+            <w:pPr>
+              <w:pStyle w:val="Compact"/>
+              <w:jc w:val="left"/>
+            </w:pPr>
+            <w:r>
+              <w:t xml:space="preserve">yes</w:t>
+            </w:r>
+          </w:p>
+        </w:tc>
+      </w:tr>
+      <w:tr>
+        <w:tc>
+          <w:tcPr/>
+          <w:p>
+            <w:pPr>
+              <w:pStyle w:val="Compact"/>
+              <w:jc w:val="left"/>
+            </w:pPr>
+            <w:r>
+              <w:t xml:space="preserve">10.1</w:t>
+            </w:r>
+          </w:p>
+        </w:tc>
+        <w:tc>
+          <w:tcPr/>
+          <w:p>
+            <w:pPr>
+              <w:pStyle w:val="Compact"/>
+              <w:jc w:val="left"/>
+            </w:pPr>
+            <w:r>
+              <w:t xml:space="preserve">neutral (73.9ms)</w:t>
+            </w:r>
+          </w:p>
+        </w:tc>
+        <w:tc>
+          <w:tcPr/>
+          <w:p>
+            <w:pPr>
+              <w:pStyle w:val="Compact"/>
+              <w:jc w:val="left"/>
+            </w:pPr>
+            <w:r>
+              <w:t xml:space="preserve">neutral (13.7ms)</w:t>
+            </w:r>
+          </w:p>
+        </w:tc>
+        <w:tc>
+          <w:tcPr/>
+          <w:p>
+            <w:pPr>
+              <w:pStyle w:val="Compact"/>
+              <w:jc w:val="left"/>
+            </w:pPr>
+            <w:r>
+              <w:t xml:space="preserve">yes</w:t>
+            </w:r>
+          </w:p>
+        </w:tc>
+      </w:tr>
+      <w:tr>
+        <w:tc>
+          <w:tcPr/>
+          <w:p>
+            <w:pPr>
+              <w:pStyle w:val="Compact"/>
+              <w:jc w:val="left"/>
+            </w:pPr>
+            <w:r>
+              <w:t xml:space="preserve">11.2</w:t>
+            </w:r>
+          </w:p>
+        </w:tc>
+        <w:tc>
+          <w:tcPr/>
+          <w:p>
+            <w:pPr>
+              <w:pStyle w:val="Compact"/>
+              <w:jc w:val="left"/>
+            </w:pPr>
+            <w:r>
+              <w:t xml:space="preserve">neutral (78.1ms)</w:t>
+            </w:r>
+          </w:p>
+        </w:tc>
+        <w:tc>
+          <w:tcPr/>
+          <w:p>
+            <w:pPr>
+              <w:pStyle w:val="Compact"/>
+              <w:jc w:val="left"/>
+            </w:pPr>
+            <w:r>
+              <w:t xml:space="preserve">neutral (15.5ms)</w:t>
+            </w:r>
+          </w:p>
+        </w:tc>
+        <w:tc>
+          <w:tcPr/>
+          <w:p>
+            <w:pPr>
+              <w:pStyle w:val="Compact"/>
+              <w:jc w:val="left"/>
+            </w:pPr>
+            <w:r>
+              <w:t xml:space="preserve">yes</w:t>
+            </w:r>
+          </w:p>
+        </w:tc>
+      </w:tr>
+      <w:tr>
+        <w:tc>
+          <w:tcPr/>
+          <w:p>
+            <w:pPr>
+              <w:pStyle w:val="Compact"/>
+              <w:jc w:val="left"/>
+            </w:pPr>
+            <w:r>
+              <w:t xml:space="preserve">12.2</w:t>
+            </w:r>
+          </w:p>
+        </w:tc>
+        <w:tc>
+          <w:tcPr/>
+          <w:p>
+            <w:pPr>
+              <w:pStyle w:val="Compact"/>
+              <w:jc w:val="left"/>
+            </w:pPr>
+            <w:r>
+              <w:t xml:space="preserve">neutral (75.0ms)</w:t>
+            </w:r>
+          </w:p>
+        </w:tc>
+        <w:tc>
+          <w:tcPr/>
+          <w:p>
+            <w:pPr>
+              <w:pStyle w:val="Compact"/>
+              <w:jc w:val="left"/>
+            </w:pPr>
+            <w:r>
+              <w:t xml:space="preserve">neutral (12.5ms)</w:t>
+            </w:r>
+          </w:p>
+        </w:tc>
+        <w:tc>
+          <w:tcPr/>
+          <w:p>
+            <w:pPr>
+              <w:pStyle w:val="Compact"/>
+              <w:jc w:val="left"/>
+            </w:pPr>
+            <w:r>
+              <w:t xml:space="preserve">yes</w:t>
+            </w:r>
+          </w:p>
+        </w:tc>
+      </w:tr>
+      <w:tr>
+        <w:tc>
+          <w:tcPr/>
+          <w:p>
+            <w:pPr>
+              <w:pStyle w:val="Compact"/>
+              <w:jc w:val="left"/>
+            </w:pPr>
+            <w:r>
+              <w:t xml:space="preserve">13.2</w:t>
+            </w:r>
+          </w:p>
+        </w:tc>
+        <w:tc>
+          <w:tcPr/>
+          <w:p>
+            <w:pPr>
+              <w:pStyle w:val="Compact"/>
+              <w:jc w:val="left"/>
+            </w:pPr>
+            <w:r>
+              <w:t xml:space="preserve">happy (63.4ms)</w:t>
+            </w:r>
+          </w:p>
+        </w:tc>
+        <w:tc>
+          <w:tcPr/>
+          <w:p>
+            <w:pPr>
+              <w:pStyle w:val="Compact"/>
+              <w:jc w:val="left"/>
+            </w:pPr>
+            <w:r>
+              <w:t xml:space="preserve">happy (15.3ms)</w:t>
+            </w:r>
+          </w:p>
+        </w:tc>
+        <w:tc>
+          <w:tcPr/>
+          <w:p>
+            <w:pPr>
+              <w:pStyle w:val="Compact"/>
+              <w:jc w:val="left"/>
+            </w:pPr>
+            <w:r>
+              <w:t xml:space="preserve">yes</w:t>
+            </w:r>
+          </w:p>
+        </w:tc>
+      </w:tr>
+      <w:tr>
+        <w:tc>
+          <w:tcPr/>
+          <w:p>
+            <w:pPr>
+              <w:pStyle w:val="Compact"/>
+              <w:jc w:val="left"/>
+            </w:pPr>
+            <w:r>
+              <w:t xml:space="preserve">14.2</w:t>
+            </w:r>
+          </w:p>
+        </w:tc>
+        <w:tc>
+          <w:tcPr/>
+          <w:p>
+            <w:pPr>
+              <w:pStyle w:val="Compact"/>
+              <w:jc w:val="left"/>
+            </w:pPr>
+            <w:r>
+              <w:t xml:space="preserve">happy (71.8ms)</w:t>
+            </w:r>
+          </w:p>
+        </w:tc>
+        <w:tc>
+          <w:tcPr/>
+          <w:p>
+            <w:pPr>
+              <w:pStyle w:val="Compact"/>
+              <w:jc w:val="left"/>
+            </w:pPr>
+            <w:r>
+              <w:t xml:space="preserve">no face detected (12.9ms)</w:t>
+            </w:r>
+          </w:p>
+        </w:tc>
+        <w:tc>
+          <w:tcPr/>
+          <w:p>
+            <w:pPr>
+              <w:pStyle w:val="Compact"/>
+              <w:jc w:val="left"/>
+            </w:pPr>
+            <w:r>
+              <w:t xml:space="preserve">-</w:t>
+            </w:r>
+          </w:p>
+        </w:tc>
+      </w:tr>
+    </w:tbl>
+    <w:p>
+      <w:pPr>
+        <w:pStyle w:val="TableCaption"/>
+      </w:pPr>
+      <w:r>
+        <w:t xml:space="preserve">Table 4. DeepFace vs. FER, run 1 (inconsistent camera framing). Average latency: DeepFace 99.8ms, FER 13.8ms. FER detected no face on 7/12 frames.</w:t>
+      </w:r>
+    </w:p>
+    <w:p>
+      <w:pPr>
+        <w:pStyle w:val="BodyText"/>
+      </w:pPr>
+      <w:r>
+        <w:t xml:space="preserve">The run was repeated with the participant facing the camera directly and consistently for the full duration, maintaining a resting/neutral expression throughout - directly testing the same resting-face condition already flagged as a limitation in the placeholder-scene and OASIS runs above. Table 5 shows the result: both models detected a face on all 13 sampled frames and agreed on every single reading (all neutral), with FER roughly six times faster on average (15.1ms vs. 91.4ms).</w:t>
+      </w:r>
+    </w:p>
+    <w:tbl>
+      <w:tblPr>
+        <w:tblStyle w:val="Table"/>
+        <w:tblW w:type="pct" w:w="5000"/>
+        <w:tblLook w:firstRow="1" w:lastRow="0" w:firstColumn="0" w:lastColumn="0" w:noHBand="0" w:noVBand="0" w:val="0020"/>
+        <w:jc w:val="start"/>
+      </w:tblPr>
+      <w:tblGrid>
+        <w:gridCol w:w="2362"/>
+        <w:gridCol w:w="2362"/>
+        <w:gridCol w:w="2362"/>
+        <w:gridCol w:w="2362"/>
+      </w:tblGrid>
+      <w:tr>
+        <w:trPr>
+          <w:tblHeader w:val="true"/>
+        </w:trPr>
+        <w:tc>
+          <w:tcPr/>
+          <w:p>
+            <w:pPr>
+              <w:pStyle w:val="Compact"/>
+              <w:jc w:val="left"/>
+            </w:pPr>
+            <w:r>
+              <w:rPr>
+                <w:bCs/>
+                <w:b/>
+              </w:rPr>
+              <w:t xml:space="preserve">Elapsed (s)</w:t>
+            </w:r>
+          </w:p>
+        </w:tc>
+        <w:tc>
+          <w:tcPr/>
+          <w:p>
+            <w:pPr>
+              <w:pStyle w:val="Compact"/>
+              <w:jc w:val="left"/>
+            </w:pPr>
+            <w:r>
+              <w:rPr>
+                <w:bCs/>
+                <w:b/>
+              </w:rPr>
+              <w:t xml:space="preserve">DeepFace label (latency)</w:t>
+            </w:r>
+          </w:p>
+        </w:tc>
+        <w:tc>
+          <w:tcPr/>
+          <w:p>
+            <w:pPr>
+              <w:pStyle w:val="Compact"/>
+              <w:jc w:val="left"/>
+            </w:pPr>
+            <w:r>
+              <w:rPr>
+                <w:bCs/>
+                <w:b/>
+              </w:rPr>
+              <w:t xml:space="preserve">FER label (latency)</w:t>
+            </w:r>
+          </w:p>
+        </w:tc>
+        <w:tc>
+          <w:tcPr/>
+          <w:p>
+            <w:pPr>
+              <w:pStyle w:val="Compact"/>
+              <w:jc w:val="left"/>
+            </w:pPr>
+            <w:r>
+              <w:rPr>
+                <w:bCs/>
+                <w:b/>
+              </w:rPr>
+              <w:t xml:space="preserve">Agreement</w:t>
+            </w:r>
+          </w:p>
+        </w:tc>
+      </w:tr>
+      <w:tr>
+        <w:tc>
+          <w:tcPr/>
+          <w:p>
+            <w:pPr>
+              <w:pStyle w:val="Compact"/>
+              <w:jc w:val="left"/>
+            </w:pPr>
+            <w:r>
+              <w:t xml:space="preserve">1.0</w:t>
+            </w:r>
+          </w:p>
+        </w:tc>
+        <w:tc>
+          <w:tcPr/>
+          <w:p>
+            <w:pPr>
+              <w:pStyle w:val="Compact"/>
+              <w:jc w:val="left"/>
+            </w:pPr>
+            <w:r>
+              <w:t xml:space="preserve">neutral (346.5ms)</w:t>
+            </w:r>
+          </w:p>
+        </w:tc>
+        <w:tc>
+          <w:tcPr/>
+          <w:p>
+            <w:pPr>
+              <w:pStyle w:val="Compact"/>
+              <w:jc w:val="left"/>
+            </w:pPr>
+            <w:r>
+              <w:t xml:space="preserve">neutral (16.5ms)</w:t>
+            </w:r>
+          </w:p>
+        </w:tc>
+        <w:tc>
+          <w:tcPr/>
+          <w:p>
+            <w:pPr>
+              <w:pStyle w:val="Compact"/>
+              <w:jc w:val="left"/>
+            </w:pPr>
+            <w:r>
+              <w:t xml:space="preserve">yes</w:t>
+            </w:r>
+          </w:p>
+        </w:tc>
+      </w:tr>
+      <w:tr>
+        <w:tc>
+          <w:tcPr/>
+          <w:p>
+            <w:pPr>
+              <w:pStyle w:val="Compact"/>
+              <w:jc w:val="left"/>
+            </w:pPr>
+            <w:r>
+              <w:t xml:space="preserve">3.6</w:t>
+            </w:r>
+          </w:p>
+        </w:tc>
+        <w:tc>
+          <w:tcPr/>
+          <w:p>
+            <w:pPr>
+              <w:pStyle w:val="Compact"/>
+              <w:jc w:val="left"/>
+            </w:pPr>
+            <w:r>
+              <w:t xml:space="preserve">neutral (73.3ms)</w:t>
+            </w:r>
+          </w:p>
+        </w:tc>
+        <w:tc>
+          <w:tcPr/>
+          <w:p>
+            <w:pPr>
+              <w:pStyle w:val="Compact"/>
+              <w:jc w:val="left"/>
+            </w:pPr>
+            <w:r>
+              <w:t xml:space="preserve">neutral (16.4ms)</w:t>
+            </w:r>
+          </w:p>
+        </w:tc>
+        <w:tc>
+          <w:tcPr/>
+          <w:p>
+            <w:pPr>
+              <w:pStyle w:val="Compact"/>
+              <w:jc w:val="left"/>
+            </w:pPr>
+            <w:r>
+              <w:t xml:space="preserve">yes</w:t>
+            </w:r>
+          </w:p>
+        </w:tc>
+      </w:tr>
+      <w:tr>
+        <w:tc>
+          <w:tcPr/>
+          <w:p>
+            <w:pPr>
+              <w:pStyle w:val="Compact"/>
+              <w:jc w:val="left"/>
+            </w:pPr>
+            <w:r>
+              <w:t xml:space="preserve">4.6</w:t>
+            </w:r>
+          </w:p>
+        </w:tc>
+        <w:tc>
+          <w:tcPr/>
+          <w:p>
+            <w:pPr>
+              <w:pStyle w:val="Compact"/>
+              <w:jc w:val="left"/>
+            </w:pPr>
+            <w:r>
+              <w:t xml:space="preserve">neutral (74.8ms)</w:t>
+            </w:r>
+          </w:p>
+        </w:tc>
+        <w:tc>
+          <w:tcPr/>
+          <w:p>
+            <w:pPr>
+              <w:pStyle w:val="Compact"/>
+              <w:jc w:val="left"/>
+            </w:pPr>
+            <w:r>
+              <w:t xml:space="preserve">neutral (14.9ms)</w:t>
+            </w:r>
+          </w:p>
+        </w:tc>
+        <w:tc>
+          <w:tcPr/>
+          <w:p>
+            <w:pPr>
+              <w:pStyle w:val="Compact"/>
+              <w:jc w:val="left"/>
+            </w:pPr>
+            <w:r>
+              <w:t xml:space="preserve">yes</w:t>
+            </w:r>
+          </w:p>
+        </w:tc>
+      </w:tr>
+      <w:tr>
+        <w:tc>
+          <w:tcPr/>
+          <w:p>
+            <w:pPr>
+              <w:pStyle w:val="Compact"/>
+              <w:jc w:val="left"/>
+            </w:pPr>
+            <w:r>
+              <w:t xml:space="preserve">5.7</w:t>
+            </w:r>
+          </w:p>
+        </w:tc>
+        <w:tc>
+          <w:tcPr/>
+          <w:p>
+            <w:pPr>
+              <w:pStyle w:val="Compact"/>
+              <w:jc w:val="left"/>
+            </w:pPr>
+            <w:r>
+              <w:t xml:space="preserve">neutral (70.3ms)</w:t>
+            </w:r>
+          </w:p>
+        </w:tc>
+        <w:tc>
+          <w:tcPr/>
+          <w:p>
+            <w:pPr>
+              <w:pStyle w:val="Compact"/>
+              <w:jc w:val="left"/>
+            </w:pPr>
+            <w:r>
+              <w:t xml:space="preserve">neutral (16.0ms)</w:t>
+            </w:r>
+          </w:p>
+        </w:tc>
+        <w:tc>
+          <w:tcPr/>
+          <w:p>
+            <w:pPr>
+              <w:pStyle w:val="Compact"/>
+              <w:jc w:val="left"/>
+            </w:pPr>
+            <w:r>
+              <w:t xml:space="preserve">yes</w:t>
+            </w:r>
+          </w:p>
+        </w:tc>
+      </w:tr>
+      <w:tr>
+        <w:tc>
+          <w:tcPr/>
+          <w:p>
+            <w:pPr>
+              <w:pStyle w:val="Compact"/>
+              <w:jc w:val="left"/>
+            </w:pPr>
+            <w:r>
+              <w:t xml:space="preserve">6.7</w:t>
+            </w:r>
+          </w:p>
+        </w:tc>
+        <w:tc>
+          <w:tcPr/>
+          <w:p>
+            <w:pPr>
+              <w:pStyle w:val="Compact"/>
+              <w:jc w:val="left"/>
+            </w:pPr>
+            <w:r>
+              <w:t xml:space="preserve">neutral (71.5ms)</w:t>
+            </w:r>
+          </w:p>
+        </w:tc>
+        <w:tc>
+          <w:tcPr/>
+          <w:p>
+            <w:pPr>
+              <w:pStyle w:val="Compact"/>
+              <w:jc w:val="left"/>
+            </w:pPr>
+            <w:r>
+              <w:t xml:space="preserve">neutral (13.8ms)</w:t>
+            </w:r>
+          </w:p>
+        </w:tc>
+        <w:tc>
+          <w:tcPr/>
+          <w:p>
+            <w:pPr>
+              <w:pStyle w:val="Compact"/>
+              <w:jc w:val="left"/>
+            </w:pPr>
+            <w:r>
+              <w:t xml:space="preserve">yes</w:t>
+            </w:r>
+          </w:p>
+        </w:tc>
+      </w:tr>
+      <w:tr>
+        <w:tc>
+          <w:tcPr/>
+          <w:p>
+            <w:pPr>
+              <w:pStyle w:val="Compact"/>
+              <w:jc w:val="left"/>
+            </w:pPr>
+            <w:r>
+              <w:t xml:space="preserve">7.7</w:t>
+            </w:r>
+          </w:p>
+        </w:tc>
+        <w:tc>
+          <w:tcPr/>
+          <w:p>
+            <w:pPr>
+              <w:pStyle w:val="Compact"/>
+              <w:jc w:val="left"/>
+            </w:pPr>
+            <w:r>
+              <w:t xml:space="preserve">neutral (67.3ms)</w:t>
+            </w:r>
+          </w:p>
+        </w:tc>
+        <w:tc>
+          <w:tcPr/>
+          <w:p>
+            <w:pPr>
+              <w:pStyle w:val="Compact"/>
+              <w:jc w:val="left"/>
+            </w:pPr>
+            <w:r>
+              <w:t xml:space="preserve">neutral (15.1ms)</w:t>
+            </w:r>
+          </w:p>
+        </w:tc>
+        <w:tc>
+          <w:tcPr/>
+          <w:p>
+            <w:pPr>
+              <w:pStyle w:val="Compact"/>
+              <w:jc w:val="left"/>
+            </w:pPr>
+            <w:r>
+              <w:t xml:space="preserve">yes</w:t>
+            </w:r>
+          </w:p>
+        </w:tc>
+      </w:tr>
+      <w:tr>
+        <w:tc>
+          <w:tcPr/>
+          <w:p>
+            <w:pPr>
+              <w:pStyle w:val="Compact"/>
+              <w:jc w:val="left"/>
+            </w:pPr>
+            <w:r>
+              <w:t xml:space="preserve">8.7</w:t>
+            </w:r>
+          </w:p>
+        </w:tc>
+        <w:tc>
+          <w:tcPr/>
+          <w:p>
+            <w:pPr>
+              <w:pStyle w:val="Compact"/>
+              <w:jc w:val="left"/>
+            </w:pPr>
+            <w:r>
+              <w:t xml:space="preserve">neutral (66.3ms)</w:t>
+            </w:r>
+          </w:p>
+        </w:tc>
+        <w:tc>
+          <w:tcPr/>
+          <w:p>
+            <w:pPr>
+              <w:pStyle w:val="Compact"/>
+              <w:jc w:val="left"/>
+            </w:pPr>
+            <w:r>
+              <w:t xml:space="preserve">neutral (15.6ms)</w:t>
+            </w:r>
+          </w:p>
+        </w:tc>
+        <w:tc>
+          <w:tcPr/>
+          <w:p>
+            <w:pPr>
+              <w:pStyle w:val="Compact"/>
+              <w:jc w:val="left"/>
+            </w:pPr>
+            <w:r>
+              <w:t xml:space="preserve">yes</w:t>
+            </w:r>
+          </w:p>
+        </w:tc>
+      </w:tr>
+      <w:tr>
+        <w:tc>
+          <w:tcPr/>
+          <w:p>
+            <w:pPr>
+              <w:pStyle w:val="Compact"/>
+              <w:jc w:val="left"/>
+            </w:pPr>
+            <w:r>
+              <w:t xml:space="preserve">9.7</w:t>
+            </w:r>
+          </w:p>
+        </w:tc>
+        <w:tc>
+          <w:tcPr/>
+          <w:p>
+            <w:pPr>
+              <w:pStyle w:val="Compact"/>
+              <w:jc w:val="left"/>
+            </w:pPr>
+            <w:r>
+              <w:t xml:space="preserve">neutral (67.8ms)</w:t>
+            </w:r>
+          </w:p>
+        </w:tc>
+        <w:tc>
+          <w:tcPr/>
+          <w:p>
+            <w:pPr>
+              <w:pStyle w:val="Compact"/>
+              <w:jc w:val="left"/>
+            </w:pPr>
+            <w:r>
+              <w:t xml:space="preserve">neutral (14.0ms)</w:t>
+            </w:r>
+          </w:p>
+        </w:tc>
+        <w:tc>
+          <w:tcPr/>
+          <w:p>
+            <w:pPr>
+              <w:pStyle w:val="Compact"/>
+              <w:jc w:val="left"/>
+            </w:pPr>
+            <w:r>
+              <w:t xml:space="preserve">yes</w:t>
+            </w:r>
+          </w:p>
+        </w:tc>
+      </w:tr>
+      <w:tr>
+        <w:tc>
+          <w:tcPr/>
+          <w:p>
+            <w:pPr>
+              <w:pStyle w:val="Compact"/>
+              <w:jc w:val="left"/>
+            </w:pPr>
+            <w:r>
+              <w:t xml:space="preserve">10.7</w:t>
+            </w:r>
+          </w:p>
+        </w:tc>
+        <w:tc>
+          <w:tcPr/>
+          <w:p>
+            <w:pPr>
+              <w:pStyle w:val="Compact"/>
+              <w:jc w:val="left"/>
+            </w:pPr>
+            <w:r>
+              <w:t xml:space="preserve">neutral (69.2ms)</w:t>
+            </w:r>
+          </w:p>
+        </w:tc>
+        <w:tc>
+          <w:tcPr/>
+          <w:p>
+            <w:pPr>
+              <w:pStyle w:val="Compact"/>
+              <w:jc w:val="left"/>
+            </w:pPr>
+            <w:r>
+              <w:t xml:space="preserve">neutral (15.4ms)</w:t>
+            </w:r>
+          </w:p>
+        </w:tc>
+        <w:tc>
+          <w:tcPr/>
+          <w:p>
+            <w:pPr>
+              <w:pStyle w:val="Compact"/>
+              <w:jc w:val="left"/>
+            </w:pPr>
+            <w:r>
+              <w:t xml:space="preserve">yes</w:t>
+            </w:r>
+          </w:p>
+        </w:tc>
+      </w:tr>
+      <w:tr>
+        <w:tc>
+          <w:tcPr/>
+          <w:p>
+            <w:pPr>
+              <w:pStyle w:val="Compact"/>
+              <w:jc w:val="left"/>
+            </w:pPr>
+            <w:r>
+              <w:t xml:space="preserve">11.7</w:t>
+            </w:r>
+          </w:p>
+        </w:tc>
+        <w:tc>
+          <w:tcPr/>
+          <w:p>
+            <w:pPr>
+              <w:pStyle w:val="Compact"/>
+              <w:jc w:val="left"/>
+            </w:pPr>
+            <w:r>
+              <w:t xml:space="preserve">neutral (70.6ms)</w:t>
+            </w:r>
+          </w:p>
+        </w:tc>
+        <w:tc>
+          <w:tcPr/>
+          <w:p>
+            <w:pPr>
+              <w:pStyle w:val="Compact"/>
+              <w:jc w:val="left"/>
+            </w:pPr>
+            <w:r>
+              <w:t xml:space="preserve">neutral (15.0ms)</w:t>
+            </w:r>
+          </w:p>
+        </w:tc>
+        <w:tc>
+          <w:tcPr/>
+          <w:p>
+            <w:pPr>
+              <w:pStyle w:val="Compact"/>
+              <w:jc w:val="left"/>
+            </w:pPr>
+            <w:r>
+              <w:t xml:space="preserve">yes</w:t>
+            </w:r>
+          </w:p>
+        </w:tc>
+      </w:tr>
+      <w:tr>
+        <w:tc>
+          <w:tcPr/>
+          <w:p>
+            <w:pPr>
+              <w:pStyle w:val="Compact"/>
+              <w:jc w:val="left"/>
+            </w:pPr>
+            <w:r>
+              <w:t xml:space="preserve">12.8</w:t>
+            </w:r>
+          </w:p>
+        </w:tc>
+        <w:tc>
+          <w:tcPr/>
+          <w:p>
+            <w:pPr>
+              <w:pStyle w:val="Compact"/>
+              <w:jc w:val="left"/>
+            </w:pPr>
+            <w:r>
+              <w:t xml:space="preserve">neutral (71.2ms)</w:t>
+            </w:r>
+          </w:p>
+        </w:tc>
+        <w:tc>
+          <w:tcPr/>
+          <w:p>
+            <w:pPr>
+              <w:pStyle w:val="Compact"/>
+              <w:jc w:val="left"/>
+            </w:pPr>
+            <w:r>
+              <w:t xml:space="preserve">neutral (13.7ms)</w:t>
+            </w:r>
+          </w:p>
+        </w:tc>
+        <w:tc>
+          <w:tcPr/>
+          <w:p>
+            <w:pPr>
+              <w:pStyle w:val="Compact"/>
+              <w:jc w:val="left"/>
+            </w:pPr>
+            <w:r>
+              <w:t xml:space="preserve">yes</w:t>
+            </w:r>
+          </w:p>
+        </w:tc>
+      </w:tr>
+      <w:tr>
+        <w:tc>
+          <w:tcPr/>
+          <w:p>
+            <w:pPr>
+              <w:pStyle w:val="Compact"/>
+              <w:jc w:val="left"/>
+            </w:pPr>
+            <w:r>
+              <w:t xml:space="preserve">13.8</w:t>
+            </w:r>
+          </w:p>
+        </w:tc>
+        <w:tc>
+          <w:tcPr/>
+          <w:p>
+            <w:pPr>
+              <w:pStyle w:val="Compact"/>
+              <w:jc w:val="left"/>
+            </w:pPr>
+            <w:r>
+              <w:t xml:space="preserve">neutral (66.0ms)</w:t>
+            </w:r>
+          </w:p>
+        </w:tc>
+        <w:tc>
+          <w:tcPr/>
+          <w:p>
+            <w:pPr>
+              <w:pStyle w:val="Compact"/>
+              <w:jc w:val="left"/>
+            </w:pPr>
+            <w:r>
+              <w:t xml:space="preserve">neutral (15.4ms)</w:t>
+            </w:r>
+          </w:p>
+        </w:tc>
+        <w:tc>
+          <w:tcPr/>
+          <w:p>
+            <w:pPr>
+              <w:pStyle w:val="Compact"/>
+              <w:jc w:val="left"/>
+            </w:pPr>
+            <w:r>
+              <w:t xml:space="preserve">yes</w:t>
+            </w:r>
+          </w:p>
+        </w:tc>
+      </w:tr>
+      <w:tr>
+        <w:tc>
+          <w:tcPr/>
+          <w:p>
+            <w:pPr>
+              <w:pStyle w:val="Compact"/>
+              <w:jc w:val="left"/>
+            </w:pPr>
+            <w:r>
+              <w:t xml:space="preserve">14.8</w:t>
+            </w:r>
+          </w:p>
+        </w:tc>
+        <w:tc>
+          <w:tcPr/>
+          <w:p>
+            <w:pPr>
+              <w:pStyle w:val="Compact"/>
+              <w:jc w:val="left"/>
+            </w:pPr>
+            <w:r>
+              <w:t xml:space="preserve">neutral (72.8ms)</w:t>
+            </w:r>
+          </w:p>
+        </w:tc>
+        <w:tc>
+          <w:tcPr/>
+          <w:p>
+            <w:pPr>
+              <w:pStyle w:val="Compact"/>
+              <w:jc w:val="left"/>
+            </w:pPr>
+            <w:r>
+              <w:t xml:space="preserve">neutral (14.5ms)</w:t>
+            </w:r>
+          </w:p>
+        </w:tc>
+        <w:tc>
+          <w:tcPr/>
+          <w:p>
+            <w:pPr>
+              <w:pStyle w:val="Compact"/>
+              <w:jc w:val="left"/>
+            </w:pPr>
+            <w:r>
+              <w:t xml:space="preserve">yes</w:t>
+            </w:r>
+          </w:p>
+        </w:tc>
+      </w:tr>
+    </w:tbl>
+    <w:p>
+      <w:pPr>
+        <w:pStyle w:val="TableCaption"/>
+      </w:pPr>
+      <w:r>
+        <w:t xml:space="preserve">Table 5. DeepFace vs. FER, run 2 (controlled framing, resting face throughout). Average latency: DeepFace 91.4ms, FER 15.1ms. 13/13 frames agreed.</w:t>
+      </w:r>
+    </w:p>
+    <w:p>
+      <w:pPr>
+        <w:pStyle w:val="BodyText"/>
+      </w:pPr>
+      <w:r>
+        <w:t xml:space="preserve">The controlled run (Table 5) is the more informative of the two: with framing held constant, DeepFace correctly read neutral on every frame of a genuine resting face, which does not reproduce the neutral-to-sad/fear misclassification seen in the earlier full-session runs (see above). This suggests camera framing or angle may be a contributing factor in that bias, rather than it being a fixed property of DeepFace on any resting face - an open question this benchmark was not designed to resolve on its own. DeepFace was retained as the primary model: with framing controlled, the two models showed no classification disagreement to justify switching, and FER's apparent detection gap in the first, uncontrolled run has an equally plausible framing-based explanation rather than a proven reliability advantage for DeepFace. FER's consistent speed advantage (roughly 6-7x faster across both runs) is noted as a reason a future iteration might reconsider this choice, particularly if frame-rate becomes a constraint, but is not sufficient on its own to switch away from a model with a working, evaluated pipeline built around it. Camera framing sensitivity in both models is flagged as worth further, more systematic investigation rather than resolved here.</w:t>
       </w:r>
     </w:p>
     <w:bookmarkEnd w:id="51"/>

</xml_diff>

<commit_message>
Add pipeline timing instrumentation and draft report sections
</commit_message>
<xml_diff>
--- a/reports/Draft_Report.docx
+++ b/reports/Draft_Report.docx
@@ -30,7 +30,6 @@
         <w:t xml:space="preserve">Template 4.1: Orchestrating AI models to achieve a goal</w:t>
       </w:r>
     </w:p>
-    <w:bookmarkEnd w:id="20"/>
     <w:bookmarkStart w:id="21" w:name="introduction"/>
     <w:p>
       <w:pPr>
@@ -77,7 +76,7 @@
         <w:pStyle w:val="BodyText"/>
       </w:pPr>
       <w:r>
-        <w:t xml:space="preserve">A more recent example is a 2025 academic paper from Brunel University London, which combined facial emotion recognition, speech-to-text, and sentiment analysis, feeding everything into a language model, a pipeline technically very similar to this project. However their system only processes pre-recorded video, is not interactive, and uses GPT-4o, a paid cloud service. The authors themselves flagged this as a privacy concern.</w:t>
+        <w:t xml:space="preserve">A more recent example is Ghatoray and Li (2025), from Brunel University London, who combined facial emotion recognition, speech-to-text, and sentiment analysis, feeding everything into a language model, a pipeline technically very similar to this project. However their system only processes pre-recorded video, is not interactive, and uses GPT-4o, a paid cloud service. The authors themselves flagged this as a privacy concern.</w:t>
       </w:r>
     </w:p>
     <w:p>
@@ -198,6 +197,14 @@
         <w:pStyle w:val="BodyText"/>
       </w:pPr>
       <w:r>
+        <w:t xml:space="preserve">Citation gaps in this chapter are now closed: the Brunel University London study is cited as Ghatoray and Li (2025) throughout (Introduction, this chapter, and Design), DeepFace, faster-whisper and j-hartmann are cited below at first mention, and the OASIS citation and IAPS note appear alongside the vision entry. Every source cited here has a matching entry in the References section.</w:t>
+      </w:r>
+    </w:p>
+    <w:p>
+      <w:pPr>
+        <w:pStyle w:val="BodyText"/>
+      </w:pPr>
+      <w:r>
         <w:t xml:space="preserve">For my project I combine several pre-trained models to achieve a common goal. The domains covered are four: vision, audio, text, and language generation. The library and model choices below were explored starting from more demanding options and downgraded to lighter frameworks where hardware constraints required it.</w:t>
       </w:r>
     </w:p>
@@ -233,7 +240,7 @@
         <w:pStyle w:val="FirstParagraph"/>
       </w:pPr>
       <w:r>
-        <w:t xml:space="preserve">For speech recognition the project uses Whisper, an open-source speech recognition model created by OpenAI (Radford et al., 2022), trained on 680,000 hours of multilingual audio and supporting 99 languages. It runs locally without needing an internet connection. In practice the project uses faster-whisper, a reimplementation that runs roughly four times faster on CPU at equivalent accuracy, which matters given the target hardware has no dedicated GPU.</w:t>
+        <w:t xml:space="preserve">For speech recognition the project uses Whisper, an open-source speech recognition model created by OpenAI (Radford et al., 2022), trained on 680,000 hours of multilingual audio and supporting 99 languages. It runs locally without needing an internet connection. In practice the project uses faster-whisper (SYSTRAN, n.d.), a reimplementation that runs roughly four times faster on CPU at equivalent accuracy, which matters given the target hardware has no dedicated GPU.</w:t>
       </w:r>
     </w:p>
     <w:p>
@@ -275,7 +282,7 @@
         <w:pStyle w:val="BodyText"/>
       </w:pPr>
       <w:r>
-        <w:t xml:space="preserve">Three candidates were benchmarked on a fixed set of test transcripts: VADER, a rule-based analyser (Hutto &amp; Gilbert, 2014); tabularisai/multilingual-sentiment-analysis; and j-hartmann/emotion-english-distilroberta-base. j-hartmann was selected, both for its higher accuracy on the test set and because it shares the same seven-emotion label space as the DeepFace facial-emotion model, allowing facial and verbal emotion to be compared directly. Full results are given in the Evaluation chapter.</w:t>
+        <w:t xml:space="preserve">Three candidates were benchmarked on a fixed set of test transcripts: VADER, a rule-based analyser (Hutto &amp; Gilbert, 2014); tabularisai/multilingual-sentiment-analysis; and j-hartmann/emotion-english-distilroberta-base. j-hartmann (Hartmann, 2022) was selected, both for its higher accuracy on the test set and because it shares the same seven-emotion label space as the DeepFace facial-emotion model, allowing facial and verbal emotion to be compared directly. Full results are given in the Evaluation chapter.</w:t>
       </w:r>
     </w:p>
     <w:bookmarkEnd w:id="27"/>
@@ -449,7 +456,7 @@
         <w:pStyle w:val="FirstParagraph"/>
       </w:pPr>
       <w:r>
-        <w:t xml:space="preserve">The system combines facial emotion recognition, speech transcription, sentiment analysis, and a local language model. This is because people often find it hard to put their feelings into words, and what they say does not always match what their face shows. Using more than one source of information gives a fuller picture than any single model could. Recent work in the field follows the same logic: the Brunel University study (2025), for example, combined facial emotion recognition with text sentiment because no single model captured the full emotional picture on its own.</w:t>
+        <w:t xml:space="preserve">The system combines facial emotion recognition, speech transcription, sentiment analysis, and a local language model. This is because people often find it hard to put their feelings into words, and what they say does not always match what their face shows. Using more than one source of information gives a fuller picture than any single model could. Recent work in the field follows the same logic: Ghatoray and Li (2025), for example, combined facial emotion recognition with text sentiment because no single model captured the full emotional picture on its own.</w:t>
       </w:r>
     </w:p>
     <w:bookmarkEnd w:id="34"/>
@@ -496,6 +503,22 @@
       </w:pPr>
       <w:r>
         <w:t xml:space="preserve">Inclusive design</w:t>
+      </w:r>
+    </w:p>
+    <w:p>
+      <w:pPr>
+        <w:pStyle w:val="FirstParagraph"/>
+      </w:pPr>
+      <w:r>
+        <w:t xml:space="preserve">The project's inclusion argument and its inclusion limitations sit on different axes, and both are stated here rather than only the former. The system requires no subscription, clinician referral, or paid appointment, and runs entirely on a personal laptop with nothing transmitted off-device; for someone who cannot afford therapy or who feels stigma discussing mental health with another person, being able to reflect privately at zero recurring cost is itself an inclusion argument, directly serving the two user groups identified in the Domain section above.</w:t>
+      </w:r>
+    </w:p>
+    <w:p>
+      <w:pPr>
+        <w:pStyle w:val="BodyText"/>
+      </w:pPr>
+      <w:r>
+        <w:t xml:space="preserve">Set against this, every pre-trained model in the pipeline carries demographic bias that this project inherits rather than corrects. Facial-analysis models are well documented to perform unevenly across skin tone and gender: the landmark Gender Shades audit found commercial gender-classification error rates below 1% for lighter-skinned men against over 30% for darker-skinned women (Buolamwini &amp; Gebru, 2018), and this project's own DeepFace resting-face misclassification (see Evaluation, Stage 1 results) was observed on a single tester, so it cannot be assumed to behave evenly, or unevenly in the same direction, across users of different skin tone or gender. Whisper and faster-whisper show a comparable pattern for speech: word error rates rise measurably for non-native and non-American-English accents relative to American and Canadian speech (Graham &amp; Roll, 2024), meaning a user's accent could silently degrade transcript quality feeding every downstream stage without the user ever being told this is happening. Finally, the terminal-plus-OpenCV interface (see Session flow and user interaction), chosen for development speed rather than accessibility, has no screen-reader support and no accommodation for colour-blindness or low vision in the picture-in-picture display; a user who cannot read the terminal clearly cannot use this tool at all. None of these three limitations was addressed within this build's scope; they are named here as constraints a future iteration should treat as a starting requirement, not an afterthought.</w:t>
       </w:r>
     </w:p>
     <w:bookmarkEnd w:id="37"/>
@@ -600,7 +623,7 @@
         <w:pStyle w:val="FirstParagraph"/>
       </w:pPr>
       <w:r>
-        <w:t xml:space="preserve">DeepFace classifies emotion from an image using a convolutional neural network (CNN). A webcam frame is first passed to a face detector that crops the face. The cropped face goes through convolutional layers, which slide filters over the image to pick out patterns (edges, then shapes, then features like a smile or a raised brow), and pooling layers, which shrink the data to keep only the strongest signals. A final softmax step turns the network's scores into probabilities across seven emotions and returns the highest one. Each frame is analysed on its own with no memory of previous frames, which is why neutral or ambiguous faces are often misread.</w:t>
+        <w:t xml:space="preserve">DeepFace (Serengil &amp; Ozpinar, 2020) classifies emotion from an image using a convolutional neural network (CNN). A webcam frame is first passed to a face detector that crops the face. The cropped face goes through convolutional layers, which slide filters over the image to pick out patterns (edges, then shapes, then features like a smile or a raised brow), and pooling layers, which shrink the data to keep only the strongest signals. A final softmax step turns the network's scores into probabilities across seven emotions and returns the highest one. Each frame is analysed on its own with no memory of previous frames, which is why neutral or ambiguous faces are often misread.</w:t>
       </w:r>
     </w:p>
     <w:p>
@@ -1195,6 +1218,14 @@
         <w:t xml:space="preserve">The third stage tests the experience with real users. Between six and ten testers rate the result with a short Likert-scale survey (1-5) on accuracy, clarity, and usefulness, alongside a pre-session self-report used to check how well the generated profile matches the user's own account.</w:t>
       </w:r>
     </w:p>
+    <w:p>
+      <w:pPr>
+        <w:pStyle w:val="BodyText"/>
+      </w:pPr>
+      <w:r>
+        <w:t xml:space="preserve">End-to-end pipeline timing was instrumented directly in pipeline.py (time.perf_counter() around each stage, written to a timestamped timing log alongside the session log) and measured across three full live runs; see End-to-end pipeline timing results below.</w:t>
+      </w:r>
+    </w:p>
     <w:bookmarkEnd w:id="50"/>
     <w:bookmarkStart w:id="51" w:name="Xc2e37ea0b03285c1cc23391b8fb3d4b0f21e91d"/>
     <w:p>
@@ -4293,6 +4324,485 @@
       </w:r>
     </w:p>
     <w:bookmarkEnd w:id="54"/>
+    <w:bookmarkStart w:id="200" w:name="end-to-end-pipeline-timing"/>
+    <w:p>
+      <w:pPr>
+        <w:pStyle w:val="Heading2"/>
+      </w:pPr>
+      <w:r>
+        <w:t xml:space="preserve">End-to-end pipeline timing</w:t>
+      </w:r>
+    </w:p>
+    <w:p>
+      <w:pPr>
+        <w:pStyle w:val="FirstParagraph"/>
+      </w:pPr>
+      <w:r>
+        <w:t xml:space="preserve">Total pipeline processing time was measured directly rather than estimated: each stage in run_pipeline() is wrapped in time.perf_counter(), and a timestamped JSON timing log is written alongside the existing session log on every completed run. Three full live runs were carried out (real consent, real webcam and microphone input, no --demo flag) on the same test machine used throughout this chapter (Intel Core i7-1185G7, 16GB RAM, no dedicated GPU). Table 6 reports the per-stage breakdown for all three.</w:t>
+      </w:r>
+    </w:p>
+    <w:tbl>
+      <w:tblPr>
+        <w:tblStyle w:val="Table"/>
+        <w:tblW w:type="pct" w:w="5000"/>
+        <w:tblLook w:firstRow="1" w:lastRow="0" w:firstColumn="0" w:lastColumn="0" w:noHBand="0" w:noVBand="0" w:val="0020"/>
+        <w:jc w:val="start"/>
+      </w:tblPr>
+      <w:tblGrid>
+        <w:gridCol w:w="1500"/>
+        <w:gridCol w:w="1500"/>
+        <w:gridCol w:w="1500"/>
+        <w:gridCol w:w="1500"/>
+        <w:gridCol w:w="1500"/>
+        <w:gridCol w:w="1548"/>
+      </w:tblGrid>
+      <w:tr>
+        <w:trPr>
+          <w:tblHeader w:val="true"/>
+        </w:trPr>
+        <w:tc>
+          <w:tcPr/>
+          <w:p>
+            <w:pPr>
+              <w:pStyle w:val="Compact"/>
+              <w:jc w:val="left"/>
+            </w:pPr>
+            <w:r>
+              <w:rPr>
+                <w:bCs/>
+                <w:b/>
+              </w:rPr>
+              <w:t xml:space="preserve">Run</w:t>
+            </w:r>
+          </w:p>
+        </w:tc>
+        <w:tc>
+          <w:tcPr/>
+          <w:p>
+            <w:pPr>
+              <w:pStyle w:val="Compact"/>
+              <w:jc w:val="left"/>
+            </w:pPr>
+            <w:r>
+              <w:rPr>
+                <w:bCs/>
+                <w:b/>
+              </w:rPr>
+              <w:t xml:space="preserve">Vision (stimulus)</w:t>
+            </w:r>
+          </w:p>
+        </w:tc>
+        <w:tc>
+          <w:tcPr/>
+          <w:p>
+            <w:pPr>
+              <w:pStyle w:val="Compact"/>
+              <w:jc w:val="left"/>
+            </w:pPr>
+            <w:r>
+              <w:rPr>
+                <w:bCs/>
+                <w:b/>
+              </w:rPr>
+              <w:t xml:space="preserve">Spoken Q + transcription</w:t>
+            </w:r>
+          </w:p>
+        </w:tc>
+        <w:tc>
+          <w:tcPr/>
+          <w:p>
+            <w:pPr>
+              <w:pStyle w:val="Compact"/>
+              <w:jc w:val="left"/>
+            </w:pPr>
+            <w:r>
+              <w:rPr>
+                <w:bCs/>
+                <w:b/>
+              </w:rPr>
+              <w:t xml:space="preserve">Text-emotion</w:t>
+            </w:r>
+          </w:p>
+        </w:tc>
+        <w:tc>
+          <w:tcPr/>
+          <w:p>
+            <w:pPr>
+              <w:pStyle w:val="Compact"/>
+              <w:jc w:val="left"/>
+            </w:pPr>
+            <w:r>
+              <w:rPr>
+                <w:bCs/>
+                <w:b/>
+              </w:rPr>
+              <w:t xml:space="preserve">Profile generation</w:t>
+            </w:r>
+          </w:p>
+        </w:tc>
+        <w:tc>
+          <w:tcPr/>
+          <w:p>
+            <w:pPr>
+              <w:pStyle w:val="Compact"/>
+              <w:jc w:val="left"/>
+            </w:pPr>
+            <w:r>
+              <w:rPr>
+                <w:bCs/>
+                <w:b/>
+              </w:rPr>
+              <w:t xml:space="preserve">Total (excl. chat)</w:t>
+            </w:r>
+          </w:p>
+        </w:tc>
+      </w:tr>
+      <w:tr>
+        <w:tc>
+          <w:tcPr/>
+          <w:p>
+            <w:pPr>
+              <w:pStyle w:val="Compact"/>
+              <w:jc w:val="left"/>
+            </w:pPr>
+            <w:r>
+              <w:t xml:space="preserve">1</w:t>
+            </w:r>
+          </w:p>
+        </w:tc>
+        <w:tc>
+          <w:tcPr/>
+          <w:p>
+            <w:pPr>
+              <w:pStyle w:val="Compact"/>
+              <w:jc w:val="left"/>
+            </w:pPr>
+            <w:r>
+              <w:t xml:space="preserve">41.48s</w:t>
+            </w:r>
+          </w:p>
+        </w:tc>
+        <w:tc>
+          <w:tcPr/>
+          <w:p>
+            <w:pPr>
+              <w:pStyle w:val="Compact"/>
+              <w:jc w:val="left"/>
+            </w:pPr>
+            <w:r>
+              <w:t xml:space="preserve">26.41s</w:t>
+            </w:r>
+          </w:p>
+        </w:tc>
+        <w:tc>
+          <w:tcPr/>
+          <w:p>
+            <w:pPr>
+              <w:pStyle w:val="Compact"/>
+              <w:jc w:val="left"/>
+            </w:pPr>
+            <w:r>
+              <w:t xml:space="preserve">2.41s</w:t>
+            </w:r>
+          </w:p>
+        </w:tc>
+        <w:tc>
+          <w:tcPr/>
+          <w:p>
+            <w:pPr>
+              <w:pStyle w:val="Compact"/>
+              <w:jc w:val="left"/>
+            </w:pPr>
+            <w:r>
+              <w:t xml:space="preserve">46.97s</w:t>
+            </w:r>
+          </w:p>
+        </w:tc>
+        <w:tc>
+          <w:tcPr/>
+          <w:p>
+            <w:pPr>
+              <w:pStyle w:val="Compact"/>
+              <w:jc w:val="left"/>
+            </w:pPr>
+            <w:r>
+              <w:t xml:space="preserve">117.27s</w:t>
+            </w:r>
+          </w:p>
+        </w:tc>
+      </w:tr>
+      <w:tr>
+        <w:tc>
+          <w:tcPr/>
+          <w:p>
+            <w:pPr>
+              <w:pStyle w:val="Compact"/>
+              <w:jc w:val="left"/>
+            </w:pPr>
+            <w:r>
+              <w:t xml:space="preserve">2</w:t>
+            </w:r>
+          </w:p>
+        </w:tc>
+        <w:tc>
+          <w:tcPr/>
+          <w:p>
+            <w:pPr>
+              <w:pStyle w:val="Compact"/>
+              <w:jc w:val="left"/>
+            </w:pPr>
+            <w:r>
+              <w:t xml:space="preserve">49.45s</w:t>
+            </w:r>
+          </w:p>
+        </w:tc>
+        <w:tc>
+          <w:tcPr/>
+          <w:p>
+            <w:pPr>
+              <w:pStyle w:val="Compact"/>
+              <w:jc w:val="left"/>
+            </w:pPr>
+            <w:r>
+              <w:t xml:space="preserve">20.92s</w:t>
+            </w:r>
+          </w:p>
+        </w:tc>
+        <w:tc>
+          <w:tcPr/>
+          <w:p>
+            <w:pPr>
+              <w:pStyle w:val="Compact"/>
+              <w:jc w:val="left"/>
+            </w:pPr>
+            <w:r>
+              <w:t xml:space="preserve">13.81s</w:t>
+            </w:r>
+          </w:p>
+        </w:tc>
+        <w:tc>
+          <w:tcPr/>
+          <w:p>
+            <w:pPr>
+              <w:pStyle w:val="Compact"/>
+              <w:jc w:val="left"/>
+            </w:pPr>
+            <w:r>
+              <w:t xml:space="preserve">34.57s</w:t>
+            </w:r>
+          </w:p>
+        </w:tc>
+        <w:tc>
+          <w:tcPr/>
+          <w:p>
+            <w:pPr>
+              <w:pStyle w:val="Compact"/>
+              <w:jc w:val="left"/>
+            </w:pPr>
+            <w:r>
+              <w:t xml:space="preserve">118.74s</w:t>
+            </w:r>
+          </w:p>
+        </w:tc>
+      </w:tr>
+      <w:tr>
+        <w:tc>
+          <w:tcPr/>
+          <w:p>
+            <w:pPr>
+              <w:pStyle w:val="Compact"/>
+              <w:jc w:val="left"/>
+            </w:pPr>
+            <w:r>
+              <w:t xml:space="preserve">3</w:t>
+            </w:r>
+          </w:p>
+        </w:tc>
+        <w:tc>
+          <w:tcPr/>
+          <w:p>
+            <w:pPr>
+              <w:pStyle w:val="Compact"/>
+              <w:jc w:val="left"/>
+            </w:pPr>
+            <w:r>
+              <w:t xml:space="preserve">47.48s</w:t>
+            </w:r>
+          </w:p>
+        </w:tc>
+        <w:tc>
+          <w:tcPr/>
+          <w:p>
+            <w:pPr>
+              <w:pStyle w:val="Compact"/>
+              <w:jc w:val="left"/>
+            </w:pPr>
+            <w:r>
+              <w:t xml:space="preserve">57.70s</w:t>
+            </w:r>
+          </w:p>
+        </w:tc>
+        <w:tc>
+          <w:tcPr/>
+          <w:p>
+            <w:pPr>
+              <w:pStyle w:val="Compact"/>
+              <w:jc w:val="left"/>
+            </w:pPr>
+            <w:r>
+              <w:t xml:space="preserve">10.34s</w:t>
+            </w:r>
+          </w:p>
+        </w:tc>
+        <w:tc>
+          <w:tcPr/>
+          <w:p>
+            <w:pPr>
+              <w:pStyle w:val="Compact"/>
+              <w:jc w:val="left"/>
+            </w:pPr>
+            <w:r>
+              <w:t xml:space="preserve">32.23s</w:t>
+            </w:r>
+          </w:p>
+        </w:tc>
+        <w:tc>
+          <w:tcPr/>
+          <w:p>
+            <w:pPr>
+              <w:pStyle w:val="Compact"/>
+              <w:jc w:val="left"/>
+            </w:pPr>
+            <w:r>
+              <w:t xml:space="preserve">147.75s</w:t>
+            </w:r>
+          </w:p>
+        </w:tc>
+      </w:tr>
+      <w:tr>
+        <w:tc>
+          <w:tcPr/>
+          <w:p>
+            <w:pPr>
+              <w:pStyle w:val="Compact"/>
+              <w:jc w:val="left"/>
+            </w:pPr>
+            <w:r>
+              <w:rPr>
+                <w:bCs/>
+                <w:b/>
+              </w:rPr>
+              <w:t xml:space="preserve">Average</w:t>
+            </w:r>
+          </w:p>
+        </w:tc>
+        <w:tc>
+          <w:tcPr/>
+          <w:p>
+            <w:pPr>
+              <w:pStyle w:val="Compact"/>
+              <w:jc w:val="left"/>
+            </w:pPr>
+            <w:r>
+              <w:rPr>
+                <w:bCs/>
+                <w:b/>
+              </w:rPr>
+              <w:t xml:space="preserve">46.1s</w:t>
+            </w:r>
+          </w:p>
+        </w:tc>
+        <w:tc>
+          <w:tcPr/>
+          <w:p>
+            <w:pPr>
+              <w:pStyle w:val="Compact"/>
+              <w:jc w:val="left"/>
+            </w:pPr>
+            <w:r>
+              <w:rPr>
+                <w:bCs/>
+                <w:b/>
+              </w:rPr>
+              <w:t xml:space="preserve">35.0s</w:t>
+            </w:r>
+          </w:p>
+        </w:tc>
+        <w:tc>
+          <w:tcPr/>
+          <w:p>
+            <w:pPr>
+              <w:pStyle w:val="Compact"/>
+              <w:jc w:val="left"/>
+            </w:pPr>
+            <w:r>
+              <w:rPr>
+                <w:bCs/>
+                <w:b/>
+              </w:rPr>
+              <w:t xml:space="preserve">8.9s</w:t>
+            </w:r>
+          </w:p>
+        </w:tc>
+        <w:tc>
+          <w:tcPr/>
+          <w:p>
+            <w:pPr>
+              <w:pStyle w:val="Compact"/>
+              <w:jc w:val="left"/>
+            </w:pPr>
+            <w:r>
+              <w:rPr>
+                <w:bCs/>
+                <w:b/>
+              </w:rPr>
+              <w:t xml:space="preserve">37.9s</w:t>
+            </w:r>
+          </w:p>
+        </w:tc>
+        <w:tc>
+          <w:tcPr/>
+          <w:p>
+            <w:pPr>
+              <w:pStyle w:val="Compact"/>
+              <w:jc w:val="left"/>
+            </w:pPr>
+            <w:r>
+              <w:rPr>
+                <w:bCs/>
+                <w:b/>
+              </w:rPr>
+              <w:t xml:space="preserve">~128s</w:t>
+            </w:r>
+          </w:p>
+        </w:tc>
+      </w:tr>
+    </w:tbl>
+    <w:p>
+      <w:pPr>
+        <w:pStyle w:val="TableCaption"/>
+      </w:pPr>
+      <w:r>
+        <w:t xml:space="preserve">Table 6. End-to-end pipeline timing across three full live runs (consent through profile generation, excluding the open-ended follow-up chat), on an Intel Core i7-1185G7, 16GB RAM, no dedicated GPU.</w:t>
+      </w:r>
+    </w:p>
+    <w:p>
+      <w:pPr>
+        <w:pStyle w:val="BodyText"/>
+      </w:pPr>
+      <w:r>
+        <w:t xml:space="preserve">Chat is excluded from the reported total because it is user-paced and open-ended rather than a fixed system cost; including it (run 1: 138.13s, run 2: 144.52s, run 3: 194.50s) would conflate the pipeline's own processing time with however long the user chooses to keep talking. The consistent finding across all three runs is that the system takes just under two minutes, on average around 128 seconds, from the start of the stimulus to a delivered profile, with no cloud round-trip anywhere in that time. Profile generation (Ollama, average 37.9s) and the vision stage (average 46.1s, which includes the ~48s stimulus display time rather than being pure DeepFace inference cost) are the two largest and most variable contributors; text-emotion analysis is consistently negligible (2.4-13.8s, the higher end likely reflecting model warm-up on first call rather than a real per-session cost). This is the honest tradeoff the fully-local design decision (see Design chapter) carries: privacy and zero data transmission are bought at the cost of a real, roughly two-minute wait before the user receives their reflection, which a cloud-based equivalent could likely shorten but only by sending emotional data off-device.</w:t>
+      </w:r>
+    </w:p>
+    <w:p>
+      <w:pPr>
+        <w:pStyle w:val="BodyText"/>
+      </w:pPr>
+      <w:r>
+        <w:t xml:space="preserve">These timing runs also surfaced two findings unrelated to timing itself, recorded here since they emerged from the same sessions. First, one run (run 2) returned an empty transcript for all three spoken questions, yet profile_generator.py still produced a confident, detailed reflection referencing content that was never said - the same over-interpretation-of-low-signal-input pattern already reported above (see Session logging), now confirmed to occur on a fully empty transcript rather than only a short one. Second, the per-scene dominant emotion returned by DeepFace varied substantially between the three runs on the same stimulus sequence (from predominantly negative to predominantly positive readings), reinforcing the direction-inconsistent misclassification already reported in Stage 1 results above rather than constituting a new finding.</w:t>
+      </w:r>
+    </w:p>
+    <w:bookmarkEnd w:id="200"/>
     <w:bookmarkStart w:id="55" w:name="session-logging"/>
     <w:p>
       <w:pPr>
@@ -4466,6 +4976,38 @@
         <w:t xml:space="preserve">6. Conclusion</w:t>
       </w:r>
     </w:p>
+    <w:p>
+      <w:pPr>
+        <w:pStyle w:val="BodyText"/>
+      </w:pPr>
+      <w:r>
+        <w:t xml:space="preserve">This project set out to build a fully local, privacy-preserving tool that helps a user reflect on their own emotional state by combining live facial-emotion detection, speech transcription, text-emotion analysis, and a local language model into a single guided session, rather than sending intimate emotional data to any cloud service or third party. The aim was to give a low-cost, stigma-reducing first step toward self-awareness and, where warranted, toward seeking real professional help, to people who cannot easily access or approach traditional mental health support.</w:t>
+      </w:r>
+    </w:p>
+    <w:p>
+      <w:pPr>
+        <w:pStyle w:val="BodyText"/>
+      </w:pPr>
+      <w:r>
+        <w:t xml:space="preserve">At draft-submission time, all four model stages run correctly end to end: facial-emotion detection, transcription, text-emotion classification and profile generation are integrated, unit-tested (46 tests across all four modules), and confirmed working together across multiple live sessions, with the language model reliably surfacing a recommendation to seek professional support when the observed pattern warrants it. Real stimulus content (OASIS) has replaced the earlier placeholder scenes, and the guided session flow - consent, stimulus, three spoken questions, profile, interactive chat, and closing resources - is fully built and has been exercised repeatedly, including in the timing runs reported in Evaluation. What remains genuinely incomplete, rather than merely under-evidenced, is user-facing validation: a pilot study is planned but not yet run, the chat stage has not yet been tested systematically for erratic or off-topic replies beyond the incidents already documented, and DeepFace's resting-face misclassification, now confirmed to be direction-inconsistent across three OASIS runs rather than a single predictable bias, has not been resolved.</w:t>
+      </w:r>
+    </w:p>
+    <w:p>
+      <w:pPr>
+        <w:pStyle w:val="BodyText"/>
+      </w:pPr>
+      <w:r>
+        <w:t xml:space="preserve">Before the final report, three pieces of work remain: a structured 5-10 message robustness test of the chat stage across both candidate language models; the planned pilot (2-3 people) and full (6-10 people) user studies, including analysis of self-report agreement and at least one documented change made in response to pilot feedback; and the Topic 9 peer review, which will specifically probe whether the conversational responses relate sensibly to the generated profile and whether the system makes clear it is not offering a diagnosis.</w:t>
+      </w:r>
+    </w:p>
+    <w:p>
+      <w:pPr>
+        <w:pStyle w:val="BodyText"/>
+      </w:pPr>
+      <w:r>
+        <w:t xml:space="preserve">One tension threads through this project and is worth naming explicitly rather than leaving implicit: fully local processing is the system's central ethical commitment, and the end-to-end timing results (Evaluation) show what that commitment costs in practice - a genuine two-minute wait between finishing the stimulus and receiving a profile, dominated by local language-model inference. A cloud-hosted equivalent could likely deliver a faster result, but only by sending a user's facial-emotion readings, transcript, and inferred emotional state to a third-party server - precisely the trade-off this project was built to avoid. Whether that wait is an acceptable cost for privacy in a mental-health-adjacent tool, or a usability problem serious enough to warrant hybrid processing in a future iteration, is an open design question this project surfaces rather than resolves.</w:t>
+      </w:r>
+    </w:p>
     <w:bookmarkEnd w:id="62"/>
     <w:bookmarkStart w:id="63" w:name="references"/>
     <w:p>
@@ -4474,6 +5016,288 @@
       </w:pPr>
       <w:r>
         <w:t xml:space="preserve">References</w:t>
+      </w:r>
+    </w:p>
+    <w:p>
+      <w:pPr>
+        <w:pStyle w:val="Bibliography"/>
+      </w:pPr>
+      <w:r>
+        <w:t xml:space="preserve">Abby Health. (2026). </w:t>
+      </w:r>
+      <w:r>
+        <w:rPr>
+          <w:iCs/>
+          <w:i/>
+        </w:rPr>
+        <w:t xml:space="preserve">Abby AI: Medical decision support system</w:t>
+      </w:r>
+      <w:r>
+        <w:t xml:space="preserve">. https://www.abbyhealth.com</w:t>
+      </w:r>
+    </w:p>
+    <w:p>
+      <w:pPr>
+        <w:pStyle w:val="Bibliography"/>
+      </w:pPr>
+      <w:r>
+        <w:t xml:space="preserve">Affectiva. (2016). </w:t>
+      </w:r>
+      <w:r>
+        <w:rPr>
+          <w:iCs/>
+          <w:i/>
+        </w:rPr>
+        <w:t xml:space="preserve">The science behind Affectiva's emotion AI</w:t>
+      </w:r>
+      <w:r>
+        <w:t xml:space="preserve">. https://www.affectiva.com</w:t>
+      </w:r>
+    </w:p>
+    <w:p>
+      <w:pPr>
+        <w:pStyle w:val="Bibliography"/>
+      </w:pPr>
+      <w:r>
+        <w:t xml:space="preserve">Buolamwini, J., &amp; Gebru, T. (2018). Gender shades: Intersectional accuracy disparities in commercial gender classification. </w:t>
+      </w:r>
+      <w:r>
+        <w:rPr>
+          <w:iCs/>
+          <w:i/>
+        </w:rPr>
+        <w:t xml:space="preserve">Proceedings of Machine Learning Research (Conference on Fairness, Accountability and Transparency)</w:t>
+      </w:r>
+      <w:r>
+        <w:t xml:space="preserve">, 81, 1-15.</w:t>
+      </w:r>
+    </w:p>
+    <w:p>
+      <w:pPr>
+        <w:pStyle w:val="Bibliography"/>
+      </w:pPr>
+      <w:r>
+        <w:t xml:space="preserve">Ezell, A. (2026). </w:t>
+      </w:r>
+      <w:r>
+        <w:rPr>
+          <w:iCs/>
+          <w:i/>
+        </w:rPr>
+        <w:t xml:space="preserve">Evaluating AI chatbots for mental health diagnosis and treatment planning</w:t>
+      </w:r>
+      <w:r>
+        <w:t xml:space="preserve"> [Unpublished study]. Widener University.</w:t>
+      </w:r>
+    </w:p>
+    <w:p>
+      <w:pPr>
+        <w:pStyle w:val="Bibliography"/>
+      </w:pPr>
+      <w:r>
+        <w:t xml:space="preserve">Ghatoray, S. K., &amp; Li, Y. (2025). Automated UX insights from user research videos by integrating facial emotion and text sentiment (arXiv:2503.22510). Department of Computer Science, Brunel University London. https://arxiv.org/abs/2503.22510</w:t>
+      </w:r>
+    </w:p>
+    <w:p>
+      <w:pPr>
+        <w:pStyle w:val="Bibliography"/>
+      </w:pPr>
+      <w:r>
+        <w:t xml:space="preserve">Graham, C., &amp; Roll, N. (2024). Evaluating OpenAI's Whisper ASR: Performance analysis across diverse accents and speaker traits. </w:t>
+      </w:r>
+      <w:r>
+        <w:rPr>
+          <w:iCs/>
+          <w:i/>
+        </w:rPr>
+        <w:t xml:space="preserve">JASA Express Letters, 4</w:t>
+      </w:r>
+      <w:r>
+        <w:t xml:space="preserve">(2), Article 025206. https://doi.org/10.1121/10.0024876</w:t>
+      </w:r>
+    </w:p>
+    <w:p>
+      <w:pPr>
+        <w:pStyle w:val="Bibliography"/>
+      </w:pPr>
+      <w:r>
+        <w:t xml:space="preserve">Hartmann, J. (2022). </w:t>
+      </w:r>
+      <w:r>
+        <w:rPr>
+          <w:iCs/>
+          <w:i/>
+        </w:rPr>
+        <w:t xml:space="preserve">Emotion English DistilRoBERTa-base</w:t>
+      </w:r>
+      <w:r>
+        <w:t xml:space="preserve"> [Model]. Hugging Face. https://huggingface.co/j-hartmann/emotion-english-distilroberta-base</w:t>
+      </w:r>
+    </w:p>
+    <w:p>
+      <w:pPr>
+        <w:pStyle w:val="Bibliography"/>
+      </w:pPr>
+      <w:r>
+        <w:t xml:space="preserve">Hugging Face. (2024). </w:t>
+      </w:r>
+      <w:r>
+        <w:rPr>
+          <w:iCs/>
+          <w:i/>
+        </w:rPr>
+        <w:t xml:space="preserve">Text classification</w:t>
+      </w:r>
+      <w:r>
+        <w:t xml:space="preserve">. https://huggingface.co/tasks/text-classification</w:t>
+      </w:r>
+    </w:p>
+    <w:p>
+      <w:pPr>
+        <w:pStyle w:val="Bibliography"/>
+      </w:pPr>
+      <w:r>
+        <w:t xml:space="preserve">Hutto, C. J., &amp; Gilbert, E. (2014). VADER: A parsimonious rule-based model for sentiment analysis of social media text. </w:t>
+      </w:r>
+      <w:r>
+        <w:rPr>
+          <w:iCs/>
+          <w:i/>
+        </w:rPr>
+        <w:t xml:space="preserve">Proceedings of the Eighth International AAAI Conference on Weblogs and Social Media</w:t>
+      </w:r>
+      <w:r>
+        <w:t xml:space="preserve">, 216-225.</w:t>
+      </w:r>
+    </w:p>
+    <w:p>
+      <w:pPr>
+        <w:pStyle w:val="Bibliography"/>
+      </w:pPr>
+      <w:r>
+        <w:t xml:space="preserve">Kurdi, B., Lozano, S., &amp; Banaji, M. R. (2017). Introducing the Open Affective Standardized Image Set (OASIS). </w:t>
+      </w:r>
+      <w:r>
+        <w:rPr>
+          <w:iCs/>
+          <w:i/>
+        </w:rPr>
+        <w:t xml:space="preserve">Behavior Research Methods, 49</w:t>
+      </w:r>
+      <w:r>
+        <w:t xml:space="preserve">(2), 457-470. https://doi.org/10.3758/s13428-016-0715-3</w:t>
+      </w:r>
+    </w:p>
+    <w:p>
+      <w:pPr>
+        <w:pStyle w:val="Bibliography"/>
+      </w:pPr>
+      <w:r>
+        <w:t xml:space="preserve">Laidi, R., et al. (2023).</w:t>
+      </w:r>
+    </w:p>
+    <w:p>
+      <w:pPr>
+        <w:pStyle w:val="Bibliography"/>
+      </w:pPr>
+      <w:r>
+        <w:t xml:space="preserve">Lee, D., et al. (2022).</w:t>
+      </w:r>
+    </w:p>
+    <w:p>
+      <w:pPr>
+        <w:pStyle w:val="Bibliography"/>
+      </w:pPr>
+      <w:r>
+        <w:t xml:space="preserve">Miller, R. (2017).</w:t>
+      </w:r>
+    </w:p>
+    <w:p>
+      <w:pPr>
+        <w:pStyle w:val="Bibliography"/>
+      </w:pPr>
+      <w:r>
+        <w:t xml:space="preserve">Ollama. (2024). </w:t>
+      </w:r>
+      <w:r>
+        <w:rPr>
+          <w:iCs/>
+          <w:i/>
+        </w:rPr>
+        <w:t xml:space="preserve">Ollama documentation</w:t>
+      </w:r>
+      <w:r>
+        <w:t xml:space="preserve">. https://ollama.com</w:t>
+      </w:r>
+    </w:p>
+    <w:p>
+      <w:pPr>
+        <w:pStyle w:val="Bibliography"/>
+      </w:pPr>
+      <w:r>
+        <w:t xml:space="preserve">OpenCV. (2026). </w:t>
+      </w:r>
+      <w:r>
+        <w:rPr>
+          <w:iCs/>
+          <w:i/>
+        </w:rPr>
+        <w:t xml:space="preserve">OpenCV: Open source computer vision library</w:t>
+      </w:r>
+      <w:r>
+        <w:t xml:space="preserve">. https://opencv.org</w:t>
+      </w:r>
+    </w:p>
+    <w:p>
+      <w:pPr>
+        <w:pStyle w:val="Bibliography"/>
+      </w:pPr>
+      <w:r>
+        <w:t xml:space="preserve">Radford, A., Kim, J. W., Xu, T., Brockman, G., McLeavey, C., &amp; Sutskever, I. (2022). Robust speech recognition via large-scale weak supervision (arXiv:2212.04356). OpenAI. https://arxiv.org/abs/2212.04356</w:t>
+      </w:r>
+    </w:p>
+    <w:p>
+      <w:pPr>
+        <w:pStyle w:val="Bibliography"/>
+      </w:pPr>
+      <w:r>
+        <w:t xml:space="preserve">Riedl, R., et al. (2024).</w:t>
+      </w:r>
+    </w:p>
+    <w:p>
+      <w:pPr>
+        <w:pStyle w:val="Bibliography"/>
+      </w:pPr>
+      <w:r>
+        <w:t xml:space="preserve">Serengil, S. I., &amp; Ozpinar, A. (2020). LightFace: A hybrid deep face recognition framework. </w:t>
+      </w:r>
+      <w:r>
+        <w:rPr>
+          <w:iCs/>
+          <w:i/>
+        </w:rPr>
+        <w:t xml:space="preserve">2020 Innovations in Intelligent Systems and Applications Conference (ASYU)</w:t>
+      </w:r>
+      <w:r>
+        <w:t xml:space="preserve">, 23-27. https://doi.org/10.1109/ASYU50717.2020.9259802</w:t>
+      </w:r>
+    </w:p>
+    <w:p>
+      <w:pPr>
+        <w:pStyle w:val="Bibliography"/>
+      </w:pPr>
+      <w:r>
+        <w:t xml:space="preserve">SYSTRAN. (n.d.). </w:t>
+      </w:r>
+      <w:r>
+        <w:rPr>
+          <w:iCs/>
+          <w:i/>
+        </w:rPr>
+        <w:t xml:space="preserve">faster-whisper</w:t>
+      </w:r>
+      <w:r>
+        <w:t xml:space="preserve"> [Computer software]. GitHub. https://github.com/SYSTRAN/faster-whisper</w:t>
       </w:r>
     </w:p>
     <w:bookmarkEnd w:id="63"/>

</xml_diff>

<commit_message>
Add screenshots, emotion timeline, and fix report numbering
- 12 screenshots placed as Figures 5-16, each cross-referenced from prose
- scripts/plot_emotion_timeline.py: per-reading emotion plot from logs/emotion_timeline.csv
- Fixed table numbering (was out of document order) and stimulus-duration error (48s -> 36s)
- Resolved visual-representation and chat-robustness TODOs
</commit_message>
<xml_diff>
--- a/reports/Draft_Report.docx
+++ b/reports/Draft_Report.docx
@@ -316,7 +316,7 @@
         <w:pStyle w:val="BodyText"/>
       </w:pPr>
       <w:r>
-        <w:t xml:space="preserve">llama3.2 and qwen2.5:3b were benchmarked on an identical sample prompt (see Evaluation, Table 3). qwen2.5:3b was notably faster on both time-to-first-token and total generation time, but its reply did not include a recommendation to seek professional help despite the sample containing a fear signal comparable to earlier tests where llama3.2 reliably included one. Given the project's severity-assessment design requirement, llama3.2 was retained as the primary model, with qwen2.5:3b noted as a faster alternative worth further, more systematic safety testing.</w:t>
+        <w:t xml:space="preserve">llama3.2 and qwen2.5:3b were benchmarked on an identical sample prompt (see Evaluation, Table 7). qwen2.5:3b was notably faster on both time-to-first-token and total generation time, but its reply did not include a recommendation to seek professional help despite the sample containing a fear signal comparable to earlier tests where llama3.2 reliably included one. Given the project's severity-assessment design requirement, llama3.2 was retained as the primary model, with qwen2.5:3b noted as a faster alternative worth further, more systematic safety testing.</w:t>
       </w:r>
     </w:p>
     <w:bookmarkEnd w:id="28"/>
@@ -632,6 +632,14 @@
       </w:pPr>
       <w:r>
         <w:t xml:space="preserve">The vision prototype was refactored from a flat script into an importable run_session() function returning a timeline of (time, scene, emotion) readings, plus a pure summarise_timeline() helper, kept separate so it can be unit-tested without hardware.</w:t>
+      </w:r>
+    </w:p>
+    <w:p>
+      <w:pPr>
+        <w:pStyle w:val="BodyText"/>
+      </w:pPr>
+      <w:r>
+        <w:t xml:space="preserve">DeepFace was benchmarked against FER, an alternative facial-emotion library with a separate Keras CNN and, by default, a different face detector (Haar Cascade), on live webcam frames sampled once per second (see Evaluation, Stage 1 results, for the full comparison and both result tables). With the face properly centred and facing the camera, the two models agreed on every reading and FER classified roughly six times faster; an earlier, less controlled run (face not consistently facing the camera) showed FER missing the face far more often than DeepFace, but that result is not treated as reliable, since it may reflect framing rather than model behaviour. DeepFace was retained as the primary model: the controlled comparison shows no classification disagreement to justify switching, and the framing-sensitivity difference between the two detectors is flagged as worth further, more controlled investigation rather than acted on now.</w:t>
       </w:r>
     </w:p>
     <w:p>
@@ -903,7 +911,57 @@
         <w:pStyle w:val="BodyText"/>
       </w:pPr>
       <w:r>
-        <w:t xml:space="preserve">With DEBUG_OVERLAY left at its default of False, a full run through all four scenes using the real OASIS images completed without errors, producing a per-scene dominant-emotion summary and a saved emotion_timeline.csv, with no scene or emotion text visible on screen during the session. The result reproduced the same negative-emotion over-detection bias already reported for the placeholder-scene runs (see Evaluation, Stage 1 results): the joyful and relaxing scenes were both dominantly read as "sad" rather than matching their intended valence, while only the threatening scene matched expectation (neutral was the closest available label, given DeepFace's resting-face tendency documented earlier). This is a further, independent data point for the same limitation rather than a new finding, and strengthens the case - already raised as a priority item - for benchmarking DeepFace against at least one alternative facial-emotion model.</w:t>
+        <w:t xml:space="preserve">With DEBUG_OVERLAY left at its default of False, a full run through all four scenes using the real OASIS images completed without errors, producing a per-scene dominant-emotion summary and a saved emotion_timeline.csv, with no scene or emotion text visible on screen during the session. The result reproduced the same negative-emotion over-detection bias already reported for the placeholder-scene runs (see Evaluation, Stage 1 results): the joyful and relaxing scenes were both dominantly read as "sad" rather than matching their intended valence, while only the threatening scene matched expectation (neutral was the closest available label, given DeepFace's resting-face tendency documented earlier). This is a further, independent data point for the same limitation rather than a new finding, and motivated the benchmark of DeepFace against an alternative facial-emotion model subsequently carried out (see Evaluation, Stage 1 results, Table 1 and Table 2). Figure 5 shows the composed session window with the debug overlays enabled.</w:t>
+      </w:r>
+    </w:p>
+    <w:p>
+      <w:pPr>
+        <w:jc w:val="center"/>
+      </w:pPr>
+      <w:r>
+        <w:drawing>
+          <wp:inline xmlns:wp="http://schemas.openxmlformats.org/drawingml/2006/wordprocessingDrawing" distT="0" distB="0" distL="0" distR="0">
+            <wp:extent cx="5486400" cy="4091812"/>
+            <wp:effectExtent l="0" t="0" r="0" b="0"/>
+            <wp:docPr id="200" name="Figure 5"/>
+            <wp:cNvGraphicFramePr>
+              <a:graphicFrameLocks xmlns:a="http://schemas.openxmlformats.org/drawingml/2006/main" noChangeAspect="1"/>
+            </wp:cNvGraphicFramePr>
+            <a:graphic xmlns:a="http://schemas.openxmlformats.org/drawingml/2006/main">
+              <a:graphicData uri="http://schemas.openxmlformats.org/drawingml/2006/picture">
+                <pic:pic xmlns:pic="http://schemas.openxmlformats.org/drawingml/2006/picture">
+                  <pic:nvPicPr>
+                    <pic:cNvPr id="200" name="Figure 5"/>
+                    <pic:cNvPicPr/>
+                  </pic:nvPicPr>
+                  <pic:blipFill>
+                    <a:blip xmlns:r="http://schemas.openxmlformats.org/officeDocument/2006/relationships" r:embed="rId13"/>
+                    <a:stretch>
+                      <a:fillRect/>
+                    </a:stretch>
+                  </pic:blipFill>
+                  <pic:spPr>
+                    <a:xfrm>
+                      <a:off x="0" y="0"/>
+                      <a:ext cx="5486400" cy="4091812"/>
+                    </a:xfrm>
+                    <a:prstGeom prst="rect">
+                      <a:avLst/>
+                    </a:prstGeom>
+                  </pic:spPr>
+                </pic:pic>
+              </a:graphicData>
+            </a:graphic>
+          </wp:inline>
+        </w:drawing>
+      </w:r>
+    </w:p>
+    <w:p>
+      <w:pPr>
+        <w:pStyle w:val="ImageCaption"/>
+      </w:pPr>
+      <w:r>
+        <w:t xml:space="preserve">Figure 5. The running session with a real OASIS stimulus filling the window and the live webcam feed inset bottom-right, shown here with DEBUG_OVERLAY enabled so the active scene label, the live detected emotion, and the FPS/latency counters are visible. All three overlays are hidden by default during a real session.</w:t>
       </w:r>
     </w:p>
     <w:bookmarkEnd w:id="42"/>
@@ -1045,7 +1103,7 @@
         <w:pStyle w:val="BodyText"/>
       </w:pPr>
       <w:r>
-        <w:t xml:space="preserve">llama3.2 was compared against qwen2.5:3b on an identical sample prompt (see Evaluation, Table 3 for full numbers). qwen2.5:3b was faster on both time-to-first-token and total generation time, and produced a more concise reply, but it did not recommend professional help for a prompt containing a fear signal similar to earlier llama3.2 tests that did trigger that recommendation. llama3.2 was kept as the primary model on this basis: for a system whose core design requirement is severity assessment, a model that reliably surfaces the seek-help recommendation is prioritised over one that is faster but less consistent on this specific behaviour.</w:t>
+        <w:t xml:space="preserve">llama3.2 was compared against qwen2.5:3b on an identical sample prompt (see Evaluation, Table 7 for full numbers). qwen2.5:3b was faster on both time-to-first-token and total generation time, and produced a more concise reply, but it did not recommend professional help for a prompt containing a fear signal similar to earlier llama3.2 tests that did trigger that recommendation. llama3.2 was kept as the primary model on this basis: for a system whose core design requirement is severity assessment, a model that reliably surfaces the seek-help recommendation is prioritised over one that is faster but less consistent on this specific behaviour.</w:t>
       </w:r>
     </w:p>
     <w:bookmarkStart w:id="45" w:name="integration-test"/>
@@ -1134,6 +1192,56 @@
     </w:p>
     <w:p>
       <w:pPr>
+        <w:jc w:val="center"/>
+      </w:pPr>
+      <w:r>
+        <w:drawing>
+          <wp:inline xmlns:wp="http://schemas.openxmlformats.org/drawingml/2006/wordprocessingDrawing" distT="0" distB="0" distL="0" distR="0">
+            <wp:extent cx="5486400" cy="1304491"/>
+            <wp:effectExtent l="0" t="0" r="0" b="0"/>
+            <wp:docPr id="201" name="Figure 6"/>
+            <wp:cNvGraphicFramePr>
+              <a:graphicFrameLocks xmlns:a="http://schemas.openxmlformats.org/drawingml/2006/main" noChangeAspect="1"/>
+            </wp:cNvGraphicFramePr>
+            <a:graphic xmlns:a="http://schemas.openxmlformats.org/drawingml/2006/main">
+              <a:graphicData uri="http://schemas.openxmlformats.org/drawingml/2006/picture">
+                <pic:pic xmlns:pic="http://schemas.openxmlformats.org/drawingml/2006/picture">
+                  <pic:nvPicPr>
+                    <pic:cNvPr id="201" name="Figure 6"/>
+                    <pic:cNvPicPr/>
+                  </pic:nvPicPr>
+                  <pic:blipFill>
+                    <a:blip xmlns:r="http://schemas.openxmlformats.org/officeDocument/2006/relationships" r:embed="rId14"/>
+                    <a:stretch>
+                      <a:fillRect/>
+                    </a:stretch>
+                  </pic:blipFill>
+                  <pic:spPr>
+                    <a:xfrm>
+                      <a:off x="0" y="0"/>
+                      <a:ext cx="5486400" cy="1304491"/>
+                    </a:xfrm>
+                    <a:prstGeom prst="rect">
+                      <a:avLst/>
+                    </a:prstGeom>
+                  </pic:spPr>
+                </pic:pic>
+              </a:graphicData>
+            </a:graphic>
+          </wp:inline>
+        </w:drawing>
+      </w:r>
+    </w:p>
+    <w:p>
+      <w:pPr>
+        <w:pStyle w:val="ImageCaption"/>
+      </w:pPr>
+      <w:r>
+        <w:t xml:space="preserve">Figure 6. The spoken_qa field of a session log, showing each of the three questions stored alongside the answer it prompted rather than as one undifferentiated transcript.</w:t>
+      </w:r>
+    </w:p>
+    <w:p>
+      <w:pPr>
         <w:pStyle w:val="BodyText"/>
       </w:pPr>
       <w:r>
@@ -1154,6 +1262,56 @@
       </w:pPr>
       <w:r>
         <w:t xml:space="preserve">--demo mode auto-confirms consent and reuses the bundled sample.wav for all three questions, so that a peer reviewer can run a complete session without a webcam, microphone or Ollama installation. The reuse is a documented limitation of demo mode rather than a defect: only one sample recording ships with the project, and the mode prints this to the terminal at each question so that three identical answers are not mistaken for three real ones.</w:t>
+      </w:r>
+    </w:p>
+    <w:p>
+      <w:pPr>
+        <w:jc w:val="center"/>
+      </w:pPr>
+      <w:r>
+        <w:drawing>
+          <wp:inline xmlns:wp="http://schemas.openxmlformats.org/drawingml/2006/wordprocessingDrawing" distT="0" distB="0" distL="0" distR="0">
+            <wp:extent cx="5486400" cy="3279724"/>
+            <wp:effectExtent l="0" t="0" r="0" b="0"/>
+            <wp:docPr id="202" name="Figure 7"/>
+            <wp:cNvGraphicFramePr>
+              <a:graphicFrameLocks xmlns:a="http://schemas.openxmlformats.org/drawingml/2006/main" noChangeAspect="1"/>
+            </wp:cNvGraphicFramePr>
+            <a:graphic xmlns:a="http://schemas.openxmlformats.org/drawingml/2006/main">
+              <a:graphicData uri="http://schemas.openxmlformats.org/drawingml/2006/picture">
+                <pic:pic xmlns:pic="http://schemas.openxmlformats.org/drawingml/2006/picture">
+                  <pic:nvPicPr>
+                    <pic:cNvPr id="202" name="Figure 7"/>
+                    <pic:cNvPicPr/>
+                  </pic:nvPicPr>
+                  <pic:blipFill>
+                    <a:blip xmlns:r="http://schemas.openxmlformats.org/officeDocument/2006/relationships" r:embed="rId15"/>
+                    <a:stretch>
+                      <a:fillRect/>
+                    </a:stretch>
+                  </pic:blipFill>
+                  <pic:spPr>
+                    <a:xfrm>
+                      <a:off x="0" y="0"/>
+                      <a:ext cx="5486400" cy="3279724"/>
+                    </a:xfrm>
+                    <a:prstGeom prst="rect">
+                      <a:avLst/>
+                    </a:prstGeom>
+                  </pic:spPr>
+                </pic:pic>
+              </a:graphicData>
+            </a:graphic>
+          </wp:inline>
+        </w:drawing>
+      </w:r>
+    </w:p>
+    <w:p>
+      <w:pPr>
+        <w:pStyle w:val="ImageCaption"/>
+      </w:pPr>
+      <w:r>
+        <w:t xml:space="preserve">Figure 7. The head of a session log, showing the consent_given and demo_mode flags recorded per session alongside the per-scene emotion summary - evidence that consent is captured per run rather than assumed.</w:t>
       </w:r>
     </w:p>
     <w:bookmarkEnd w:id="47"/>
@@ -1164,6 +1322,14 @@
       </w:pPr>
       <w:r>
         <w:t xml:space="preserve">Visual representation of the product / results</w:t>
+      </w:r>
+    </w:p>
+    <w:p>
+      <w:pPr>
+        <w:pStyle w:val="FirstParagraph"/>
+      </w:pPr>
+      <w:r>
+        <w:t xml:space="preserve">Rather than collecting the system's visual evidence into a single gallery, each figure is placed in the section whose claim it supports and is referred to there by number. The running system is shown in Figure 5 (a real OASIS stimulus with the live webcam inset and the detection overlays enabled), with the earlier placeholder-stage prototype in Figures 1-4 for comparison. The guided session flow and its logging are evidenced in Figures 6 and 7 (the per-question spoken answers, and the consent and demo-mode flags recorded per run). Benchmark and result evidence sits with the corresponding results section: Figure 8 for the per-reading emotion timeline of a complete stimulus sequence, Figure 9 for speech-to-text, Figures 10-12 for the three text-emotion candidates, Figure 13 for a generated profile with the seek-help flag set, Figure 14 for a stage-timing log, Figure 15 for a follow-up chat exchange referring back to its own profile, and Figure 16 for the full passing test suite.</w:t>
       </w:r>
     </w:p>
     <w:bookmarkEnd w:id="48"/>
@@ -1273,7 +1439,57 @@
         <w:pStyle w:val="BodyText"/>
       </w:pPr>
       <w:r>
-        <w:t xml:space="preserve">A later run with the real OASIS stimulus in place complicates this picture rather than confirming it: the sad scene was dominantly misread as happy, the opposite direction from the sad/fear over-detection seen in the two runs above, while the other three scenes read as neutral. Taken together, the misclassification does not consistently favour negative emotion as first thought; it is direction-inconsistent, which if anything is a more serious problem for the profile-generation stage than a predictable bias would be, since a consistent error could in principle be corrected for, whereas an inconsistent one cannot.</w:t>
+        <w:t xml:space="preserve">A later run with the real OASIS stimulus in place complicates this picture rather than confirming it: the sad scene was dominantly misread as happy, the opposite direction from the sad/fear over-detection seen in the two runs above, while the other three scenes read as neutral. Taken together, the misclassification does not consistently favour negative emotion as first thought; it is direction-inconsistent, which if anything is a more serious problem for the profile-generation stage than a predictable bias would be, since a consistent error could in principle be corrected for, whereas an inconsistent one cannot. Figure 8 plots every reading from this run, showing the misclassification is not scattered noise but a sustained block: the happy readings run continuously for roughly the first half of the sad scene before reverting to neutral.</w:t>
+      </w:r>
+    </w:p>
+    <w:p>
+      <w:pPr>
+        <w:jc w:val="center"/>
+      </w:pPr>
+      <w:r>
+        <w:drawing>
+          <wp:inline xmlns:wp="http://schemas.openxmlformats.org/drawingml/2006/wordprocessingDrawing" distT="0" distB="0" distL="0" distR="0">
+            <wp:extent cx="5486400" cy="2170370"/>
+            <wp:effectExtent l="0" t="0" r="0" b="0"/>
+            <wp:docPr id="211" name="Figure 8"/>
+            <wp:cNvGraphicFramePr>
+              <a:graphicFrameLocks xmlns:a="http://schemas.openxmlformats.org/drawingml/2006/main" noChangeAspect="1"/>
+            </wp:cNvGraphicFramePr>
+            <a:graphic xmlns:a="http://schemas.openxmlformats.org/drawingml/2006/main">
+              <a:graphicData uri="http://schemas.openxmlformats.org/drawingml/2006/picture">
+                <pic:pic xmlns:pic="http://schemas.openxmlformats.org/drawingml/2006/picture">
+                  <pic:nvPicPr>
+                    <pic:cNvPr id="211" name="Figure 8"/>
+                    <pic:cNvPicPr/>
+                  </pic:nvPicPr>
+                  <pic:blipFill>
+                    <a:blip xmlns:r="http://schemas.openxmlformats.org/officeDocument/2006/relationships" r:embed="rId24"/>
+                    <a:stretch>
+                      <a:fillRect/>
+                    </a:stretch>
+                  </pic:blipFill>
+                  <pic:spPr>
+                    <a:xfrm>
+                      <a:off x="0" y="0"/>
+                      <a:ext cx="5486400" cy="2170370"/>
+                    </a:xfrm>
+                    <a:prstGeom prst="rect">
+                      <a:avLst/>
+                    </a:prstGeom>
+                  </pic:spPr>
+                </pic:pic>
+              </a:graphicData>
+            </a:graphic>
+          </wp:inline>
+        </w:drawing>
+      </w:r>
+    </w:p>
+    <w:p>
+      <w:pPr>
+        <w:pStyle w:val="ImageCaption"/>
+      </w:pPr>
+      <w:r>
+        <w:t xml:space="preserve">Figure 8. Detected emotion for every reading across one full OASIS sequence, with the four scenes shaded behind. The run is dominated by neutral readings, with a sustained block of happy misclassification through the first half of the sad scene - the direction-inconsistent error described above - and two isolated fear readings during the relaxing scene.</w:t>
       </w:r>
     </w:p>
     <w:p>
@@ -1297,7 +1513,7 @@
         <w:pStyle w:val="BodyText"/>
       </w:pPr>
       <w:r>
-        <w:t xml:space="preserve">The first run was not tightly controlled for camera framing (the participant was not consistently facing the camera throughout). Table 4 shows the result: FER failed to detect a face on 7 of 12 sampled frames, against zero missed detections for DeepFace, while both models agreed on every frame where FER did detect a face. This is not treated as a reliable finding about the two models' relative robustness, since it may reflect FER's detector being more sensitive to off-centre framing rather than a genuine reliability gap; it is reported for completeness rather than acted on.</w:t>
+        <w:t xml:space="preserve">The first run was not tightly controlled for camera framing (the participant was not consistently facing the camera throughout). Table 1 shows the result: FER failed to detect a face on 7 of 12 sampled frames, against zero missed detections for DeepFace, while both models agreed on every frame where FER did detect a face. This is not treated as a reliable finding about the two models' relative robustness, since it may reflect FER's detector being more sensitive to off-centre framing rather than a genuine reliability gap; it is reported for completeness rather than acted on.</w:t>
       </w:r>
     </w:p>
     <w:tbl>
@@ -1988,15 +2204,15 @@
         <w:pStyle w:val="TableCaption"/>
       </w:pPr>
       <w:r>
-        <w:t xml:space="preserve">Table 4. DeepFace vs. FER, run 1 (inconsistent camera framing). Average latency: DeepFace 99.8ms, FER 13.8ms. FER detected no face on 7/12 frames.</w:t>
-      </w:r>
-    </w:p>
-    <w:p>
-      <w:pPr>
-        <w:pStyle w:val="BodyText"/>
-      </w:pPr>
-      <w:r>
-        <w:t xml:space="preserve">The run was repeated with the participant facing the camera directly and consistently for the full duration, maintaining a resting/neutral expression throughout - directly testing the same resting-face condition already flagged as a limitation in the placeholder-scene and OASIS runs above. Table 5 shows the result: both models detected a face on all 13 sampled frames and agreed on every single reading (all neutral), with FER roughly six times faster on average (15.1ms vs. 91.4ms).</w:t>
+        <w:t xml:space="preserve">Table 1. DeepFace vs. FER, run 1 (inconsistent camera framing). Average latency: DeepFace 99.8ms, FER 13.8ms. FER detected no face on 7/12 frames.</w:t>
+      </w:r>
+    </w:p>
+    <w:p>
+      <w:pPr>
+        <w:pStyle w:val="BodyText"/>
+      </w:pPr>
+      <w:r>
+        <w:t xml:space="preserve">The run was repeated with the participant facing the camera directly and consistently for the full duration, maintaining a resting/neutral expression throughout - directly testing the same resting-face condition already flagged as a limitation in the placeholder-scene and OASIS runs above. Table 2 shows the result: both models detected a face on all 13 sampled frames and agreed on every single reading (all neutral), with FER roughly six times faster on average (15.1ms vs. 91.4ms).</w:t>
       </w:r>
     </w:p>
     <w:tbl>
@@ -2737,15 +2953,15 @@
         <w:pStyle w:val="TableCaption"/>
       </w:pPr>
       <w:r>
-        <w:t xml:space="preserve">Table 5. DeepFace vs. FER, run 2 (controlled framing, resting face throughout). Average latency: DeepFace 91.4ms, FER 15.1ms. 13/13 frames agreed.</w:t>
-      </w:r>
-    </w:p>
-    <w:p>
-      <w:pPr>
-        <w:pStyle w:val="BodyText"/>
-      </w:pPr>
-      <w:r>
-        <w:t xml:space="preserve">The controlled run (Table 5) is the more informative of the two: with framing held constant, DeepFace correctly read neutral on every frame of a genuine resting face, which does not reproduce the neutral-to-sad/fear misclassification seen in the earlier full-session runs (see above). This suggests camera framing or angle may be a contributing factor in that bias, rather than it being a fixed property of DeepFace on any resting face - an open question this benchmark was not designed to resolve on its own. DeepFace was retained as the primary model: with framing controlled, the two models showed no classification disagreement to justify switching, and FER's apparent detection gap in the first, uncontrolled run has an equally plausible framing-based explanation rather than a proven reliability advantage for DeepFace. FER's consistent speed advantage (roughly 6-7x faster across both runs) is noted as a reason a future iteration might reconsider this choice, particularly if frame-rate becomes a constraint, but is not sufficient on its own to switch away from a model with a working, evaluated pipeline built around it. Camera framing sensitivity in both models is flagged as worth further, more systematic investigation rather than resolved here.</w:t>
+        <w:t xml:space="preserve">Table 2. DeepFace vs. FER, run 2 (controlled framing, resting face throughout). Average latency: DeepFace 91.4ms, FER 15.1ms. 13/13 frames agreed.</w:t>
+      </w:r>
+    </w:p>
+    <w:p>
+      <w:pPr>
+        <w:pStyle w:val="BodyText"/>
+      </w:pPr>
+      <w:r>
+        <w:t xml:space="preserve">The controlled run (Table 2) is the more informative of the two: with framing held constant, DeepFace correctly read neutral on every frame of a genuine resting face, which does not reproduce the neutral-to-sad/fear misclassification seen in the earlier full-session runs (see above). This suggests camera framing or angle may be a contributing factor in that bias, rather than it being a fixed property of DeepFace on any resting face - an open question this benchmark was not designed to resolve on its own. DeepFace was retained as the primary model: with framing controlled, the two models showed no classification disagreement to justify switching, and FER's apparent detection gap in the first, uncontrolled run has an equally plausible framing-based explanation rather than a proven reliability advantage for DeepFace. FER's consistent speed advantage (roughly 6-7x faster across both runs) is noted as a reason a future iteration might reconsider this choice, particularly if frame-rate becomes a constraint, but is not sufficient on its own to switch away from a model with a working, evaluated pipeline built around it. Camera framing sensitivity in both models is flagged as worth further, more systematic investigation rather than resolved here.</w:t>
       </w:r>
     </w:p>
     <w:bookmarkEnd w:id="51"/>
@@ -2771,7 +2987,7 @@
         <w:pStyle w:val="BodyText"/>
       </w:pPr>
       <w:r>
-        <w:t xml:space="preserve">faster-whisper was then benchmarked in isolation against the original openai-whisper on the same audio file, both at the tiny model size (see Table 1a). faster-whisper was faster on transcription (0.54s vs 1.05s), used substantially less peak memory (13.4MB vs 72.1MB), and was more accurate on this file: openai-whisper again mis-transcribed "microphone" as "Micah Cup", while faster-whisper transcribed the sentence correctly in full. openai-whisper additionally required a system-level ffmpeg installation to run at all, which faster-whisper does not - a further practical point in favour of the chosen library for a tool intended to be simple to set up locally.</w:t>
+        <w:t xml:space="preserve">faster-whisper was then benchmarked in isolation against the original openai-whisper on the same audio file, both at the tiny model size (see Table 3). faster-whisper was faster on transcription (0.54s vs 1.05s), used substantially less peak memory (13.4MB vs 72.1MB), and was more accurate on this file: openai-whisper again mis-transcribed "microphone" as "Micah Cup", while faster-whisper transcribed the sentence correctly in full. openai-whisper additionally required a system-level ffmpeg installation to run at all, which faster-whisper does not - a further practical point in favour of the chosen library for a tool intended to be simple to set up locally.</w:t>
       </w:r>
     </w:p>
     <w:tbl>
@@ -3007,7 +3223,57 @@
           <w:iCs/>
           <w:i/>
         </w:rPr>
-        <w:t xml:space="preserve">Table 1a. faster-whisper vs openai-whisper on an identical audio file, tiny model size, on an Intel Core i7-1185G7, 16GB RAM, no dedicated GPU. Peak memory measured with tracemalloc, isolated per model; this captures Python-level allocations only and likely understates true peak memory, since it does not see inside PyTorch's C/C++ tensor backend.</w:t>
+        <w:t xml:space="preserve">Table 3. faster-whisper vs openai-whisper on an identical audio file, tiny model size, on an Intel Core i7-1185G7, 16GB RAM, no dedicated GPU. Peak memory measured with tracemalloc, isolated per model; this captures Python-level allocations only and likely understates true peak memory, since it does not see inside PyTorch's C/C++ tensor backend.</w:t>
+      </w:r>
+    </w:p>
+    <w:p>
+      <w:pPr>
+        <w:jc w:val="center"/>
+      </w:pPr>
+      <w:r>
+        <w:drawing>
+          <wp:inline xmlns:wp="http://schemas.openxmlformats.org/drawingml/2006/wordprocessingDrawing" distT="0" distB="0" distL="0" distR="0">
+            <wp:extent cx="5486400" cy="1723980"/>
+            <wp:effectExtent l="0" t="0" r="0" b="0"/>
+            <wp:docPr id="203" name="Figure 9"/>
+            <wp:cNvGraphicFramePr>
+              <a:graphicFrameLocks xmlns:a="http://schemas.openxmlformats.org/drawingml/2006/main" noChangeAspect="1"/>
+            </wp:cNvGraphicFramePr>
+            <a:graphic xmlns:a="http://schemas.openxmlformats.org/drawingml/2006/main">
+              <a:graphicData uri="http://schemas.openxmlformats.org/drawingml/2006/picture">
+                <pic:pic xmlns:pic="http://schemas.openxmlformats.org/drawingml/2006/picture">
+                  <pic:nvPicPr>
+                    <pic:cNvPr id="203" name="Figure 9"/>
+                    <pic:cNvPicPr/>
+                  </pic:nvPicPr>
+                  <pic:blipFill>
+                    <a:blip xmlns:r="http://schemas.openxmlformats.org/officeDocument/2006/relationships" r:embed="rId16"/>
+                    <a:stretch>
+                      <a:fillRect/>
+                    </a:stretch>
+                  </pic:blipFill>
+                  <pic:spPr>
+                    <a:xfrm>
+                      <a:off x="0" y="0"/>
+                      <a:ext cx="5486400" cy="1723980"/>
+                    </a:xfrm>
+                    <a:prstGeom prst="rect">
+                      <a:avLst/>
+                    </a:prstGeom>
+                  </pic:spPr>
+                </pic:pic>
+              </a:graphicData>
+            </a:graphic>
+          </wp:inline>
+        </w:drawing>
+      </w:r>
+    </w:p>
+    <w:p>
+      <w:pPr>
+        <w:pStyle w:val="ImageCaption"/>
+      </w:pPr>
+      <w:r>
+        <w:t xml:space="preserve">Figure 9. audio_benchmark.py output. The final line of each transcript shows the accuracy difference reported above: faster-whisper returns "microphone" where openai-whisper returns "Micah Cup".</w:t>
       </w:r>
     </w:p>
     <w:bookmarkEnd w:id="52"/>
@@ -3041,7 +3307,7 @@
         <w:pStyle w:val="BodyText"/>
       </w:pPr>
       <w:r>
-        <w:t xml:space="preserve">Table 1 summarises average performance per candidate model across all 10 test transcripts.</w:t>
+        <w:t xml:space="preserve">Table 4 summarises average performance per candidate model across all 10 test transcripts.</w:t>
       </w:r>
     </w:p>
     <w:tbl>
@@ -3286,15 +3552,15 @@
           <w:iCs/>
           <w:i/>
         </w:rPr>
-        <w:t xml:space="preserve">Table 1. Average latency per candidate model on an Intel Core i7-1185G7, 16GB RAM, no dedicated GPU. Memory: tracemalloc reported 193.2MB peak Python memory across the full benchmark run (all three models); per-model isolation was not measured in this run and is noted as a limitation.</w:t>
-      </w:r>
-    </w:p>
-    <w:p>
-      <w:pPr>
-        <w:pStyle w:val="BodyText"/>
-      </w:pPr>
-      <w:r>
-        <w:t xml:space="preserve">Table 2 shows the label each model predicted for every test transcript, against the expected label. Bold indicates a mismatch with the expected label.</w:t>
+        <w:t xml:space="preserve">Table 4. Average latency per candidate model on an Intel Core i7-1185G7, 16GB RAM, no dedicated GPU. Memory: tracemalloc reported 193.2MB peak Python memory across the full benchmark run (all three models); per-model isolation was not measured in this run and is noted as a limitation.</w:t>
+      </w:r>
+    </w:p>
+    <w:p>
+      <w:pPr>
+        <w:pStyle w:val="BodyText"/>
+      </w:pPr>
+      <w:r>
+        <w:t xml:space="preserve">Table 5 shows the label each model predicted for every test transcript, against the expected label. Bold indicates a mismatch with the expected label.</w:t>
       </w:r>
     </w:p>
     <w:tbl>
@@ -4026,7 +4292,157 @@
           <w:iCs/>
           <w:i/>
         </w:rPr>
-        <w:t xml:space="preserve">Table 2. Predicted label per model against the expected label for each test transcript, run on an Intel Core i7-1185G7, 16GB RAM, no dedicated GPU.</w:t>
+        <w:t xml:space="preserve">Table 5. Predicted label per model against the expected label for each test transcript, run on an Intel Core i7-1185G7, 16GB RAM, no dedicated GPU.</w:t>
+      </w:r>
+    </w:p>
+    <w:p>
+      <w:pPr>
+        <w:jc w:val="center"/>
+      </w:pPr>
+      <w:r>
+        <w:drawing>
+          <wp:inline xmlns:wp="http://schemas.openxmlformats.org/drawingml/2006/wordprocessingDrawing" distT="0" distB="0" distL="0" distR="0">
+            <wp:extent cx="5486400" cy="1406429"/>
+            <wp:effectExtent l="0" t="0" r="0" b="0"/>
+            <wp:docPr id="204" name="Figure 10"/>
+            <wp:cNvGraphicFramePr>
+              <a:graphicFrameLocks xmlns:a="http://schemas.openxmlformats.org/drawingml/2006/main" noChangeAspect="1"/>
+            </wp:cNvGraphicFramePr>
+            <a:graphic xmlns:a="http://schemas.openxmlformats.org/drawingml/2006/main">
+              <a:graphicData uri="http://schemas.openxmlformats.org/drawingml/2006/picture">
+                <pic:pic xmlns:pic="http://schemas.openxmlformats.org/drawingml/2006/picture">
+                  <pic:nvPicPr>
+                    <pic:cNvPr id="204" name="Figure 10"/>
+                    <pic:cNvPicPr/>
+                  </pic:nvPicPr>
+                  <pic:blipFill>
+                    <a:blip xmlns:r="http://schemas.openxmlformats.org/officeDocument/2006/relationships" r:embed="rId17"/>
+                    <a:stretch>
+                      <a:fillRect/>
+                    </a:stretch>
+                  </pic:blipFill>
+                  <pic:spPr>
+                    <a:xfrm>
+                      <a:off x="0" y="0"/>
+                      <a:ext cx="5486400" cy="1406429"/>
+                    </a:xfrm>
+                    <a:prstGeom prst="rect">
+                      <a:avLst/>
+                    </a:prstGeom>
+                  </pic:spPr>
+                </pic:pic>
+              </a:graphicData>
+            </a:graphic>
+          </wp:inline>
+        </w:drawing>
+      </w:r>
+    </w:p>
+    <w:p>
+      <w:pPr>
+        <w:pStyle w:val="ImageCaption"/>
+      </w:pPr>
+      <w:r>
+        <w:t xml:space="preserve">Figure 10. sentiment_benchmark.py output for VADER, showing the 3-class limitation: the surprise and disgust transcripts both fall back to neutral.</w:t>
+      </w:r>
+    </w:p>
+    <w:p>
+      <w:pPr>
+        <w:jc w:val="center"/>
+      </w:pPr>
+      <w:r>
+        <w:drawing>
+          <wp:inline xmlns:wp="http://schemas.openxmlformats.org/drawingml/2006/wordprocessingDrawing" distT="0" distB="0" distL="0" distR="0">
+            <wp:extent cx="5486400" cy="1540158"/>
+            <wp:effectExtent l="0" t="0" r="0" b="0"/>
+            <wp:docPr id="205" name="Figure 11"/>
+            <wp:cNvGraphicFramePr>
+              <a:graphicFrameLocks xmlns:a="http://schemas.openxmlformats.org/drawingml/2006/main" noChangeAspect="1"/>
+            </wp:cNvGraphicFramePr>
+            <a:graphic xmlns:a="http://schemas.openxmlformats.org/drawingml/2006/main">
+              <a:graphicData uri="http://schemas.openxmlformats.org/drawingml/2006/picture">
+                <pic:pic xmlns:pic="http://schemas.openxmlformats.org/drawingml/2006/picture">
+                  <pic:nvPicPr>
+                    <pic:cNvPr id="205" name="Figure 11"/>
+                    <pic:cNvPicPr/>
+                  </pic:nvPicPr>
+                  <pic:blipFill>
+                    <a:blip xmlns:r="http://schemas.openxmlformats.org/officeDocument/2006/relationships" r:embed="rId18"/>
+                    <a:stretch>
+                      <a:fillRect/>
+                    </a:stretch>
+                  </pic:blipFill>
+                  <pic:spPr>
+                    <a:xfrm>
+                      <a:off x="0" y="0"/>
+                      <a:ext cx="5486400" cy="1540158"/>
+                    </a:xfrm>
+                    <a:prstGeom prst="rect">
+                      <a:avLst/>
+                    </a:prstGeom>
+                  </pic:spPr>
+                </pic:pic>
+              </a:graphicData>
+            </a:graphic>
+          </wp:inline>
+        </w:drawing>
+      </w:r>
+    </w:p>
+    <w:p>
+      <w:pPr>
+        <w:pStyle w:val="ImageCaption"/>
+      </w:pPr>
+      <w:r>
+        <w:t xml:space="preserve">Figure 11. sentiment_benchmark.py output for j-hartmann/emotion-english-distilroberta-base, the selected model - the only candidate to label surprise and disgust correctly.</w:t>
+      </w:r>
+    </w:p>
+    <w:p>
+      <w:pPr>
+        <w:jc w:val="center"/>
+      </w:pPr>
+      <w:r>
+        <w:drawing>
+          <wp:inline xmlns:wp="http://schemas.openxmlformats.org/drawingml/2006/wordprocessingDrawing" distT="0" distB="0" distL="0" distR="0">
+            <wp:extent cx="5486400" cy="1864729"/>
+            <wp:effectExtent l="0" t="0" r="0" b="0"/>
+            <wp:docPr id="206" name="Figure 12"/>
+            <wp:cNvGraphicFramePr>
+              <a:graphicFrameLocks xmlns:a="http://schemas.openxmlformats.org/drawingml/2006/main" noChangeAspect="1"/>
+            </wp:cNvGraphicFramePr>
+            <a:graphic xmlns:a="http://schemas.openxmlformats.org/drawingml/2006/main">
+              <a:graphicData uri="http://schemas.openxmlformats.org/drawingml/2006/picture">
+                <pic:pic xmlns:pic="http://schemas.openxmlformats.org/drawingml/2006/picture">
+                  <pic:nvPicPr>
+                    <pic:cNvPr id="206" name="Figure 12"/>
+                    <pic:cNvPicPr/>
+                  </pic:nvPicPr>
+                  <pic:blipFill>
+                    <a:blip xmlns:r="http://schemas.openxmlformats.org/officeDocument/2006/relationships" r:embed="rId19"/>
+                    <a:stretch>
+                      <a:fillRect/>
+                    </a:stretch>
+                  </pic:blipFill>
+                  <pic:spPr>
+                    <a:xfrm>
+                      <a:off x="0" y="0"/>
+                      <a:ext cx="5486400" cy="1864729"/>
+                    </a:xfrm>
+                    <a:prstGeom prst="rect">
+                      <a:avLst/>
+                    </a:prstGeom>
+                  </pic:spPr>
+                </pic:pic>
+              </a:graphicData>
+            </a:graphic>
+          </wp:inline>
+        </w:drawing>
+      </w:r>
+    </w:p>
+    <w:p>
+      <w:pPr>
+        <w:pStyle w:val="ImageCaption"/>
+      </w:pPr>
+      <w:r>
+        <w:t xml:space="preserve">Figure 12. sentiment_benchmark.py output for tabularisai/multilingual-sentiment-analysis, showing the negative-label bias described above, with the run's peak memory figure.</w:t>
       </w:r>
     </w:p>
     <w:bookmarkEnd w:id="53"/>
@@ -4049,6 +4465,56 @@
     </w:p>
     <w:p>
       <w:pPr>
+        <w:jc w:val="center"/>
+      </w:pPr>
+      <w:r>
+        <w:drawing>
+          <wp:inline xmlns:wp="http://schemas.openxmlformats.org/drawingml/2006/wordprocessingDrawing" distT="0" distB="0" distL="0" distR="0">
+            <wp:extent cx="5486400" cy="496065"/>
+            <wp:effectExtent l="0" t="0" r="0" b="0"/>
+            <wp:docPr id="207" name="Figure 13"/>
+            <wp:cNvGraphicFramePr>
+              <a:graphicFrameLocks xmlns:a="http://schemas.openxmlformats.org/drawingml/2006/main" noChangeAspect="1"/>
+            </wp:cNvGraphicFramePr>
+            <a:graphic xmlns:a="http://schemas.openxmlformats.org/drawingml/2006/main">
+              <a:graphicData uri="http://schemas.openxmlformats.org/drawingml/2006/picture">
+                <pic:pic xmlns:pic="http://schemas.openxmlformats.org/drawingml/2006/picture">
+                  <pic:nvPicPr>
+                    <pic:cNvPr id="207" name="Figure 13"/>
+                    <pic:cNvPicPr/>
+                  </pic:nvPicPr>
+                  <pic:blipFill>
+                    <a:blip xmlns:r="http://schemas.openxmlformats.org/officeDocument/2006/relationships" r:embed="rId20"/>
+                    <a:stretch>
+                      <a:fillRect/>
+                    </a:stretch>
+                  </pic:blipFill>
+                  <pic:spPr>
+                    <a:xfrm>
+                      <a:off x="0" y="0"/>
+                      <a:ext cx="5486400" cy="496065"/>
+                    </a:xfrm>
+                    <a:prstGeom prst="rect">
+                      <a:avLst/>
+                    </a:prstGeom>
+                  </pic:spPr>
+                </pic:pic>
+              </a:graphicData>
+            </a:graphic>
+          </wp:inline>
+        </w:drawing>
+      </w:r>
+    </w:p>
+    <w:p>
+      <w:pPr>
+        <w:pStyle w:val="ImageCaption"/>
+      </w:pPr>
+      <w:r>
+        <w:t xml:space="preserve">Figure 13. The profile section of a session log, with seek_help correctly set to true for a session whose generated reflection recommended professional support.</w:t>
+      </w:r>
+    </w:p>
+    <w:p>
+      <w:pPr>
         <w:pStyle w:val="BodyText"/>
       </w:pPr>
       <w:r>
@@ -4068,15 +4534,230 @@
         <w:pStyle w:val="BodyText"/>
       </w:pPr>
       <w:r>
-        <w:t xml:space="preserve">One notable limitation surfaced during this testing: on at least one follow-up turn, llama3.2 produced a reply that misjudged the intent of an ambiguous user message and responded with an inappropriate, unrelated safety refusal rather than asking for clarification or responding sensibly. The reply was incorrect and out of context rather than unsafe in itself, but it illustrates a real risk for this project: a small local model can misread short or ambiguous input in unpredictable ways, and for a tool operating in a mental-health-adjacent context, an erratic or nonsensical response at the wrong moment could undermine user trust or feel dismissive. This is treated as an open risk to test more systematically (varied phrasing, ambiguous input, edge cases) rather than something resolved by this build, and is a strong candidate topic for the Design chapter's discussion of model limitations and for the final report's evaluation of alternative models.</w:t>
-      </w:r>
-    </w:p>
-    <w:p>
-      <w:pPr>
-        <w:pStyle w:val="BodyText"/>
-      </w:pPr>
-      <w:r>
-        <w:t xml:space="preserve">llama3.2 and qwen2.5:3b were compared on an identical sample prompt built from a simulated emotion summary, transcript, and text-emotion result (see ollama_benchmark.py). Results are given in Table 3.</w:t>
+        <w:t xml:space="preserve">One notable limitation surfaced during this testing: on at least one follow-up turn, llama3.2 produced a reply that misjudged the intent of an ambiguous user message and responded with an inappropriate, unrelated safety refusal rather than asking for clarification or responding sensibly. The reply was incorrect and out of context rather than unsafe in itself, but it illustrates a real risk for this project: a small local model can misread short or ambiguous input in unpredictable ways, and for a tool operating in a mental-health-adjacent context, an erratic or nonsensical response at the wrong moment could undermine user trust or feel dismissive. This single incident is followed up systematically below.</w:t>
+      </w:r>
+    </w:p>
+    <w:p>
+      <w:pPr>
+        <w:pStyle w:val="BodyText"/>
+      </w:pPr>
+      <w:r>
+        <w:t xml:space="preserve">A structured robustness test (chat_robustness_test.py) was then run to replace this single anecdote with a systematic count: 10 varied and ambiguous follow-up messages - spanning short/terse input, an off-topic question, ambiguous emotional statements, a direct diagnosis request, sarcasm, a meta-question about data handling, nonsense input, a topic shift, mild distress language, and a reference back to earlier context - were sent through the same conversation history on both llama3.2 and qwen2.5:3b, starting from an identical profile context on each model. Table 6 summarises the outcome per model.</w:t>
+      </w:r>
+    </w:p>
+    <w:tbl>
+      <w:tblPr>
+        <w:tblStyle w:val="Table"/>
+        <w:tblW w:type="pct" w:w="5000"/>
+        <w:tblLook w:firstRow="1" w:lastRow="0" w:firstColumn="0" w:lastColumn="0" w:noHBand="0" w:noVBand="0" w:val="0020"/>
+        <w:jc w:val="start"/>
+      </w:tblPr>
+      <w:tblGrid>
+        <w:gridCol w:w="2500"/>
+        <w:gridCol w:w="1750"/>
+        <w:gridCol w:w="1750"/>
+        <w:gridCol w:w="2500"/>
+      </w:tblGrid>
+      <w:tr>
+        <w:trPr>
+          <w:tblHeader w:val="true"/>
+        </w:trPr>
+        <w:tc>
+          <w:tcPr/>
+          <w:p>
+            <w:pPr>
+              <w:pStyle w:val="Compact"/>
+              <w:jc w:val="left"/>
+            </w:pPr>
+            <w:r>
+              <w:rPr>
+                <w:bCs/>
+                <w:b/>
+              </w:rPr>
+              <w:t xml:space="preserve">Model</w:t>
+            </w:r>
+          </w:p>
+        </w:tc>
+        <w:tc>
+          <w:tcPr/>
+          <w:p>
+            <w:pPr>
+              <w:pStyle w:val="Compact"/>
+              <w:jc w:val="left"/>
+            </w:pPr>
+            <w:r>
+              <w:rPr>
+                <w:bCs/>
+                <w:b/>
+              </w:rPr>
+              <w:t xml:space="preserve">On-topic / appropriate</w:t>
+            </w:r>
+          </w:p>
+        </w:tc>
+        <w:tc>
+          <w:tcPr/>
+          <w:p>
+            <w:pPr>
+              <w:pStyle w:val="Compact"/>
+              <w:jc w:val="left"/>
+            </w:pPr>
+            <w:r>
+              <w:rPr>
+                <w:bCs/>
+                <w:b/>
+              </w:rPr>
+              <w:t xml:space="preserve">Inappropriate refusal</w:t>
+            </w:r>
+          </w:p>
+        </w:tc>
+        <w:tc>
+          <w:tcPr/>
+          <w:p>
+            <w:pPr>
+              <w:pStyle w:val="Compact"/>
+              <w:jc w:val="left"/>
+            </w:pPr>
+            <w:r>
+              <w:rPr>
+                <w:bCs/>
+                <w:b/>
+              </w:rPr>
+              <w:t xml:space="preserve">Factually wrong (system-inconsistent)</w:t>
+            </w:r>
+          </w:p>
+        </w:tc>
+      </w:tr>
+      <w:tr>
+        <w:tc>
+          <w:tcPr/>
+          <w:p>
+            <w:pPr>
+              <w:pStyle w:val="Compact"/>
+              <w:jc w:val="left"/>
+            </w:pPr>
+            <w:r>
+              <w:t xml:space="preserve">llama3.2</w:t>
+            </w:r>
+          </w:p>
+        </w:tc>
+        <w:tc>
+          <w:tcPr/>
+          <w:p>
+            <w:pPr>
+              <w:pStyle w:val="Compact"/>
+              <w:jc w:val="left"/>
+            </w:pPr>
+            <w:r>
+              <w:t xml:space="preserve">7/10</w:t>
+            </w:r>
+          </w:p>
+        </w:tc>
+        <w:tc>
+          <w:tcPr/>
+          <w:p>
+            <w:pPr>
+              <w:pStyle w:val="Compact"/>
+              <w:jc w:val="left"/>
+            </w:pPr>
+            <w:r>
+              <w:t xml:space="preserve">2/10</w:t>
+            </w:r>
+          </w:p>
+        </w:tc>
+        <w:tc>
+          <w:tcPr/>
+          <w:p>
+            <w:pPr>
+              <w:pStyle w:val="Compact"/>
+              <w:jc w:val="left"/>
+            </w:pPr>
+            <w:r>
+              <w:t xml:space="preserve">1/10</w:t>
+            </w:r>
+          </w:p>
+        </w:tc>
+      </w:tr>
+      <w:tr>
+        <w:tc>
+          <w:tcPr/>
+          <w:p>
+            <w:pPr>
+              <w:pStyle w:val="Compact"/>
+              <w:jc w:val="left"/>
+            </w:pPr>
+            <w:r>
+              <w:t xml:space="preserve">qwen2.5:3b</w:t>
+            </w:r>
+          </w:p>
+        </w:tc>
+        <w:tc>
+          <w:tcPr/>
+          <w:p>
+            <w:pPr>
+              <w:pStyle w:val="Compact"/>
+              <w:jc w:val="left"/>
+            </w:pPr>
+            <w:r>
+              <w:t xml:space="preserve">9/10</w:t>
+            </w:r>
+          </w:p>
+        </w:tc>
+        <w:tc>
+          <w:tcPr/>
+          <w:p>
+            <w:pPr>
+              <w:pStyle w:val="Compact"/>
+              <w:jc w:val="left"/>
+            </w:pPr>
+            <w:r>
+              <w:t xml:space="preserve">0/10</w:t>
+            </w:r>
+          </w:p>
+        </w:tc>
+        <w:tc>
+          <w:tcPr/>
+          <w:p>
+            <w:pPr>
+              <w:pStyle w:val="Compact"/>
+              <w:jc w:val="left"/>
+            </w:pPr>
+            <w:r>
+              <w:t xml:space="preserve">1/10</w:t>
+            </w:r>
+          </w:p>
+        </w:tc>
+      </w:tr>
+    </w:tbl>
+    <w:p>
+      <w:pPr>
+        <w:pStyle w:val="TableCaption"/>
+      </w:pPr>
+      <w:r>
+        <w:t xml:space="preserve">Table 6. Chat robustness test, 10 messages per model, classified from the full reply transcripts (see logs/chat_robustness_results.csv).</w:t>
+      </w:r>
+    </w:p>
+    <w:p>
+      <w:pPr>
+        <w:pStyle w:val="BodyText"/>
+      </w:pPr>
+      <w:r>
+        <w:t xml:space="preserve">The result confirms the original finding rather than overturning it: llama3.2 produced an inappropriate refusal on 2 of 10 messages (sarcasm and a reference back to earlier context, neither of which requested a diagnosis), refusing with "I can't provide a diagnosis" when no diagnosis had been asked for. qwen2.5:3b produced zero inappropriate refusals across the same 10 messages, correctly distinguishing an actual diagnosis request (which it declined appropriately) from messages that only superficially resembled one. This strengthens the case, raised in the Design chapter, that qwen2.5:3b's weaker seek-help consistency (Table 7, below) needs to be weighed against a more reliable non-refusal behaviour elsewhere, rather than treating llama3.2 as the safer choice by default.</w:t>
+      </w:r>
+    </w:p>
+    <w:p>
+      <w:pPr>
+        <w:pStyle w:val="BodyText"/>
+      </w:pPr>
+      <w:r>
+        <w:t xml:space="preserve">One result was unexpected and is more serious than a refusal-style error: both models, asked "Are you saving what I just told you?", told the user their conversation was not being saved or stored ("each time you interact with me, it's a new conversation" / "I don't actually 'save' your conversations"). This directly contradicts both the consent screen, which discloses that the session and transcript are saved to a local log file, and the actual behaviour of save_session_log(), which does write the full chat history to disk after every session. Neither model was given this information in its system prompt, so this is an unprompted, confident, and incorrect claim about the system's own data handling, made immediately after the user consented to that same data handling being different. This is treated as a more significant finding than the refusal-rate result above: an erratic reply undermines trust, but a factually wrong answer about logging directly undermines informed consent, and is flagged as a priority fix - either instructing the model correctly on this point in the system prompt, or intercepting and answering this class of question outside the language model entirely.</w:t>
+      </w:r>
+    </w:p>
+    <w:p>
+      <w:pPr>
+        <w:pStyle w:val="BodyText"/>
+      </w:pPr>
+      <w:r>
+        <w:t xml:space="preserve">llama3.2 and qwen2.5:3b were compared on an identical sample prompt built from a simulated emotion summary, transcript, and text-emotion result (see ollama_benchmark.py). Results are given in Table 7.</w:t>
       </w:r>
     </w:p>
     <w:tbl>
@@ -4312,7 +4993,7 @@
           <w:iCs/>
           <w:i/>
         </w:rPr>
-        <w:t xml:space="preserve">Table 3. Local LLM comparison for profile generation, run on an identical sample emotion summary (facial emotions + transcript + sentiment scores) on an Intel Core i7-1185G7, 16GB RAM, no dedicated GPU.</w:t>
+        <w:t xml:space="preserve">Table 7. Local LLM comparison for profile generation, run on an identical sample emotion summary (facial emotions + transcript + sentiment scores) on an Intel Core i7-1185G7, 16GB RAM, no dedicated GPU.</w:t>
       </w:r>
     </w:p>
     <w:p>
@@ -4338,7 +5019,7 @@
         <w:pStyle w:val="FirstParagraph"/>
       </w:pPr>
       <w:r>
-        <w:t xml:space="preserve">Total pipeline processing time was measured directly rather than estimated: each stage in run_pipeline() is wrapped in time.perf_counter(), and a timestamped JSON timing log is written alongside the existing session log on every completed run. Three full live runs were carried out (real consent, real webcam and microphone input, no --demo flag) on the same test machine used throughout this chapter (Intel Core i7-1185G7, 16GB RAM, no dedicated GPU). Table 6 reports the per-stage breakdown for all three.</w:t>
+        <w:t xml:space="preserve">Total pipeline processing time was measured directly rather than estimated: each stage in run_pipeline() is wrapped in time.perf_counter(), and a timestamped JSON timing log is written alongside the existing session log on every completed run. Three full live runs were carried out (real consent, real webcam and microphone input, no --demo flag) on the same test machine used throughout this chapter (Intel Core i7-1185G7, 16GB RAM, no dedicated GPU). Table 8 reports the per-stage breakdown for all three.</w:t>
       </w:r>
     </w:p>
     <w:tbl>
@@ -4783,15 +5464,15 @@
         <w:pStyle w:val="TableCaption"/>
       </w:pPr>
       <w:r>
-        <w:t xml:space="preserve">Table 6. End-to-end pipeline timing across three full live runs (consent through profile generation, excluding the open-ended follow-up chat), on an Intel Core i7-1185G7, 16GB RAM, no dedicated GPU.</w:t>
-      </w:r>
-    </w:p>
-    <w:p>
-      <w:pPr>
-        <w:pStyle w:val="BodyText"/>
-      </w:pPr>
-      <w:r>
-        <w:t xml:space="preserve">Chat is excluded from the reported total because it is user-paced and open-ended rather than a fixed system cost; including it (run 1: 138.13s, run 2: 144.52s, run 3: 194.50s) would conflate the pipeline's own processing time with however long the user chooses to keep talking. The consistent finding across all three runs is that the system takes just under two minutes, on average around 128 seconds, from the start of the stimulus to a delivered profile, with no cloud round-trip anywhere in that time. Profile generation (Ollama, average 37.9s) and the vision stage (average 46.1s, which includes the ~48s stimulus display time rather than being pure DeepFace inference cost) are the two largest and most variable contributors; text-emotion analysis is consistently negligible (2.4-13.8s, the higher end likely reflecting model warm-up on first call rather than a real per-session cost). This is the honest tradeoff the fully-local design decision (see Design chapter) carries: privacy and zero data transmission are bought at the cost of a real, roughly two-minute wait before the user receives their reflection, which a cloud-based equivalent could likely shorten but only by sending emotional data off-device.</w:t>
+        <w:t xml:space="preserve">Table 8. End-to-end pipeline timing across three full live runs (consent through profile generation, excluding the open-ended follow-up chat), on an Intel Core i7-1185G7, 16GB RAM, no dedicated GPU.</w:t>
+      </w:r>
+    </w:p>
+    <w:p>
+      <w:pPr>
+        <w:pStyle w:val="BodyText"/>
+      </w:pPr>
+      <w:r>
+        <w:t xml:space="preserve">Chat is excluded from the reported total because it is user-paced and open-ended rather than a fixed system cost; including it (run 1: 138.13s, run 2: 144.52s, run 3: 194.50s) would conflate the pipeline's own processing time with however long the user chooses to keep talking. The consistent finding across all three runs is that the system takes just under two minutes, on average around 128 seconds, from the start of the stimulus to a delivered profile, with no cloud round-trip anywhere in that time. Profile generation (Ollama, average 37.9s) and the vision stage (average 46.1s, which includes the 36-second stimulus display time (twelve images at three seconds each) rather than being pure DeepFace inference cost) are the two largest and most variable contributors; text-emotion analysis is consistently negligible (2.4-13.8s, the higher end likely reflecting model warm-up on first call rather than a real per-session cost). This is the honest tradeoff the fully-local design decision (see Design chapter) carries: privacy and zero data transmission are bought at the cost of a real, roughly two-minute wait before the user receives their reflection, which a cloud-based equivalent could likely shorten but only by sending emotional data off-device.</w:t>
       </w:r>
     </w:p>
     <w:p>
@@ -4800,6 +5481,56 @@
       </w:pPr>
       <w:r>
         <w:t xml:space="preserve">These timing runs also surfaced two findings unrelated to timing itself, recorded here since they emerged from the same sessions. First, one run (run 2) returned an empty transcript for all three spoken questions, yet profile_generator.py still produced a confident, detailed reflection referencing content that was never said - the same over-interpretation-of-low-signal-input pattern already reported above (see Session logging), now confirmed to occur on a fully empty transcript rather than only a short one. Second, the per-scene dominant emotion returned by DeepFace varied substantially between the three runs on the same stimulus sequence (from predominantly negative to predominantly positive readings), reinforcing the direction-inconsistent misclassification already reported in Stage 1 results above rather than constituting a new finding.</w:t>
+      </w:r>
+    </w:p>
+    <w:p>
+      <w:pPr>
+        <w:jc w:val="center"/>
+      </w:pPr>
+      <w:r>
+        <w:drawing>
+          <wp:inline xmlns:wp="http://schemas.openxmlformats.org/drawingml/2006/wordprocessingDrawing" distT="0" distB="0" distL="0" distR="0">
+            <wp:extent cx="4867275" cy="2552700"/>
+            <wp:effectExtent l="0" t="0" r="0" b="0"/>
+            <wp:docPr id="208" name="Figure 14"/>
+            <wp:cNvGraphicFramePr>
+              <a:graphicFrameLocks xmlns:a="http://schemas.openxmlformats.org/drawingml/2006/main" noChangeAspect="1"/>
+            </wp:cNvGraphicFramePr>
+            <a:graphic xmlns:a="http://schemas.openxmlformats.org/drawingml/2006/main">
+              <a:graphicData uri="http://schemas.openxmlformats.org/drawingml/2006/picture">
+                <pic:pic xmlns:pic="http://schemas.openxmlformats.org/drawingml/2006/picture">
+                  <pic:nvPicPr>
+                    <pic:cNvPr id="208" name="Figure 14"/>
+                    <pic:cNvPicPr/>
+                  </pic:nvPicPr>
+                  <pic:blipFill>
+                    <a:blip xmlns:r="http://schemas.openxmlformats.org/officeDocument/2006/relationships" r:embed="rId21"/>
+                    <a:stretch>
+                      <a:fillRect/>
+                    </a:stretch>
+                  </pic:blipFill>
+                  <pic:spPr>
+                    <a:xfrm>
+                      <a:off x="0" y="0"/>
+                      <a:ext cx="4867275" cy="2552700"/>
+                    </a:xfrm>
+                    <a:prstGeom prst="rect">
+                      <a:avLst/>
+                    </a:prstGeom>
+                  </pic:spPr>
+                </pic:pic>
+              </a:graphicData>
+            </a:graphic>
+          </wp:inline>
+        </w:drawing>
+      </w:r>
+    </w:p>
+    <w:p>
+      <w:pPr>
+        <w:pStyle w:val="ImageCaption"/>
+      </w:pPr>
+      <w:r>
+        <w:t xml:space="preserve">Figure 14. A timing log written at the end of a completed session, recording per-stage seconds and both totals. This is the raw form of the run 3 column in Table 8.</w:t>
       </w:r>
     </w:p>
     <w:bookmarkEnd w:id="200"/>
@@ -4818,6 +5549,56 @@
       </w:pPr>
       <w:r>
         <w:t xml:space="preserve">Session logging (save_session_log()) was verified with a full live run: webcam capture, a spoken response, sentiment classification, profile generation, and a short follow-up chat, all written to a single timestamped JSON file. It was re-verified after the guided session flow was added, confirming that the consent status, demo-mode flag, and all three question-and-answer pairs are captured alongside the existing stage outputs. The chat history in the log confirmed the model correctly retained context across turns, referencing the earlier profile discussion when later asked what it remembered.</w:t>
+      </w:r>
+    </w:p>
+    <w:p>
+      <w:pPr>
+        <w:jc w:val="center"/>
+      </w:pPr>
+      <w:r>
+        <w:drawing>
+          <wp:inline xmlns:wp="http://schemas.openxmlformats.org/drawingml/2006/wordprocessingDrawing" distT="0" distB="0" distL="0" distR="0">
+            <wp:extent cx="5486400" cy="1483104"/>
+            <wp:effectExtent l="0" t="0" r="0" b="0"/>
+            <wp:docPr id="209" name="Figure 15"/>
+            <wp:cNvGraphicFramePr>
+              <a:graphicFrameLocks xmlns:a="http://schemas.openxmlformats.org/drawingml/2006/main" noChangeAspect="1"/>
+            </wp:cNvGraphicFramePr>
+            <a:graphic xmlns:a="http://schemas.openxmlformats.org/drawingml/2006/main">
+              <a:graphicData uri="http://schemas.openxmlformats.org/drawingml/2006/picture">
+                <pic:pic xmlns:pic="http://schemas.openxmlformats.org/drawingml/2006/picture">
+                  <pic:nvPicPr>
+                    <pic:cNvPr id="209" name="Figure 15"/>
+                    <pic:cNvPicPr/>
+                  </pic:nvPicPr>
+                  <pic:blipFill>
+                    <a:blip xmlns:r="http://schemas.openxmlformats.org/officeDocument/2006/relationships" r:embed="rId22"/>
+                    <a:stretch>
+                      <a:fillRect/>
+                    </a:stretch>
+                  </pic:blipFill>
+                  <pic:spPr>
+                    <a:xfrm>
+                      <a:off x="0" y="0"/>
+                      <a:ext cx="5486400" cy="1483104"/>
+                    </a:xfrm>
+                    <a:prstGeom prst="rect">
+                      <a:avLst/>
+                    </a:prstGeom>
+                  </pic:spPr>
+                </pic:pic>
+              </a:graphicData>
+            </a:graphic>
+          </wp:inline>
+        </w:drawing>
+      </w:r>
+    </w:p>
+    <w:p>
+      <w:pPr>
+        <w:pStyle w:val="ImageCaption"/>
+      </w:pPr>
+      <w:r>
+        <w:t xml:space="preserve">Figure 15. The chat_history field of a session log. The assistant's first reply refers directly back to the mismatch identified in the profile it had just generated, confirming session context is retained across turns.</w:t>
       </w:r>
     </w:p>
     <w:p>
@@ -4879,6 +5660,56 @@
       </w:pPr>
       <w:r>
         <w:t xml:space="preserve">The full suite (46 tests across all four modules) passes: 17 vision tests, 6 sentiment tests, 8 profile-generator tests, and 15 session-flow tests, running in seconds with no external services, hardware or downloaded models required.</w:t>
+      </w:r>
+    </w:p>
+    <w:p>
+      <w:pPr>
+        <w:jc w:val="center"/>
+      </w:pPr>
+      <w:r>
+        <w:drawing>
+          <wp:inline xmlns:wp="http://schemas.openxmlformats.org/drawingml/2006/wordprocessingDrawing" distT="0" distB="0" distL="0" distR="0">
+            <wp:extent cx="5486400" cy="3542753"/>
+            <wp:effectExtent l="0" t="0" r="0" b="0"/>
+            <wp:docPr id="210" name="Figure 16"/>
+            <wp:cNvGraphicFramePr>
+              <a:graphicFrameLocks xmlns:a="http://schemas.openxmlformats.org/drawingml/2006/main" noChangeAspect="1"/>
+            </wp:cNvGraphicFramePr>
+            <a:graphic xmlns:a="http://schemas.openxmlformats.org/drawingml/2006/main">
+              <a:graphicData uri="http://schemas.openxmlformats.org/drawingml/2006/picture">
+                <pic:pic xmlns:pic="http://schemas.openxmlformats.org/drawingml/2006/picture">
+                  <pic:nvPicPr>
+                    <pic:cNvPr id="210" name="Figure 16"/>
+                    <pic:cNvPicPr/>
+                  </pic:nvPicPr>
+                  <pic:blipFill>
+                    <a:blip xmlns:r="http://schemas.openxmlformats.org/officeDocument/2006/relationships" r:embed="rId23"/>
+                    <a:stretch>
+                      <a:fillRect/>
+                    </a:stretch>
+                  </pic:blipFill>
+                  <pic:spPr>
+                    <a:xfrm>
+                      <a:off x="0" y="0"/>
+                      <a:ext cx="5486400" cy="3542753"/>
+                    </a:xfrm>
+                    <a:prstGeom prst="rect">
+                      <a:avLst/>
+                    </a:prstGeom>
+                  </pic:spPr>
+                </pic:pic>
+              </a:graphicData>
+            </a:graphic>
+          </wp:inline>
+        </w:drawing>
+      </w:r>
+    </w:p>
+    <w:p>
+      <w:pPr>
+        <w:pStyle w:val="ImageCaption"/>
+      </w:pPr>
+      <w:r>
+        <w:t xml:space="preserve">Figure 16. The full pytest suite: 46 tests across the four testable modules, passing in 16.16s with no external services, hardware or downloaded models required.</w:t>
       </w:r>
     </w:p>
     <w:p>
@@ -4954,15 +5785,15 @@
         <w:pStyle w:val="FirstParagraph"/>
       </w:pPr>
       <w:r>
-        <w:t xml:space="preserve">The project is on track against its stated goal: a locally-run system combining multiple pre-trained models into a coherent psychological profile. All four stages are now implemented, integrated, and confirmed working together in a fully live end-to-end run, and are wrapped in the complete guided session flow: consent, stimulus with facial emotion detection, three separately recorded spoken questions, transcription, text-emotion classification, profile generation, an interactive follow-up conversation, and a closing message signposting professional support. Vision has been formally benchmarked for capture speed and scene-tagging accuracy, with one documented limitation around neutral-face misclassification. Text-emotion analysis, speech-to-text and language-model generation have each in addition been benchmarked against named alternatives and justified on the evidence (Tables 1, 1a, 2 and 3). Vision is now the only stage whose chosen model has not been compared against an alternative.</w:t>
-      </w:r>
-    </w:p>
-    <w:p>
-      <w:pPr>
-        <w:pStyle w:val="BodyText"/>
-      </w:pPr>
-      <w:r>
-        <w:t xml:space="preserve">The main work remaining before the final report is not building new stages, but strengthening what exists: replacing the simulated per-scene stimulus with real calibrated content, benchmarking DeepFace against at least one alternative facial-emotion model - now the highest priority of these, given the resting-face result reported above - more systematically testing the chat stage for erratic or off-topic replies across both candidate language models (an initial limitation was identified during live testing with llama3.2 - see Evaluation, Stage 4 results), and running the planned six-to-ten person user study. The pipeline's architecture (small, independently-testable modules coordinated by pipeline.py) means each of these is an isolated change rather than a restructuring effort.</w:t>
+        <w:t xml:space="preserve">The project is on track against its stated goal: a locally-run system combining multiple pre-trained models into a coherent psychological profile. All four stages are now implemented, integrated, and confirmed working together in a fully live end-to-end run, and are wrapped in the complete guided session flow: consent, stimulus with facial emotion detection, three separately recorded spoken questions, transcription, text-emotion classification, profile generation, an interactive follow-up conversation, and a closing message signposting professional support. All four stages now also have compare-and-reject evidence against a named alternative (Table 1-Table 7), with vision's DeepFace-vs-FER comparison the most recently closed of these. End-to-end pipeline timing is measured (Table 8) and the chat stage has been tested systematically rather than on a single incident (Table 6).</w:t>
+      </w:r>
+    </w:p>
+    <w:p>
+      <w:pPr>
+        <w:pStyle w:val="BodyText"/>
+      </w:pPr>
+      <w:r>
+        <w:t xml:space="preserve">The main work remaining before the final report is no longer benchmarking or instrumentation but validation with real users and iteration on what that validation surfaces: running the planned pilot (2-3 people) and full (6-10 person) user studies, addressing the factually-wrong data-handling claim both language models produced under the chat robustness test (see Stage 4 results), and resolving DeepFace's direction-inconsistent resting-face misclassification, which the FER comparison narrowed to a likely camera-framing factor without fully resolving. The pipeline's architecture (small, independently-testable modules coordinated by pipeline.py) means each of these is an isolated change rather than a restructuring effort.</w:t>
       </w:r>
     </w:p>
     <w:bookmarkEnd w:id="60"/>

</xml_diff>

<commit_message>
Add pilot user study results to Evaluation
- Table 9: post-session Likert scores, 5 pilot participants (means 3.4/3.8/4.2)
- Quote-linked analysis tying survey feedback to individual session logs
- Flagged seek_help over-triggering (5/5 sessions) as priority for September
- Updated demographic-limitations section to reflect actual pilot scope
</commit_message>
<xml_diff>
--- a/reports/Draft_Report.docx
+++ b/reports/Draft_Report.docx
@@ -5760,6 +5760,445 @@
         <w:t xml:space="preserve">User testing</w:t>
       </w:r>
     </w:p>
+    <w:p>
+      <w:pPr>
+        <w:pStyle w:val="FirstParagraph"/>
+      </w:pPr>
+      <w:r>
+        <w:t xml:space="preserve">A pilot study was run with 5 participants (friends and family, recruited as a convenience sample) ahead of the full 6-10 person study planned for September. Each participant received a verbal explanation of what the session involves - webcam and microphone recording, three spoken questions, a generated non-diagnostic reflection, and that they could stop at any time - before typing "yes" at the system's own consent prompt (get_consent(), session.py), which is recorded as consent_given: true in every session log (Figure 7). Recordings and logs remain on-device only. Each session was a real, unscripted run of the full guided flow: stimulus, three spoken questions, profile generation, and an open follow-up conversation. Immediately afterwards, participants completed a short survey: three 1-5 Likert statements (accuracy, clarity, willingness to use again) and two free-text questions asking whether the profile matched how they actually felt and for any other comments.</w:t>
+      </w:r>
+    </w:p>
+    <w:tbl>
+      <w:tblPr>
+        <w:tblStyle w:val="Table"/>
+        <w:tblW w:type="pct" w:w="5000"/>
+        <w:tblLook w:firstRow="1" w:lastRow="0" w:firstColumn="0" w:lastColumn="0" w:noHBand="0" w:noVBand="0" w:val="0020"/>
+        <w:jc w:val="start"/>
+      </w:tblPr>
+      <w:tblGrid>
+        <w:gridCol w:w="1800"/>
+        <w:gridCol w:w="2500"/>
+        <w:gridCol w:w="2500"/>
+        <w:gridCol w:w="2700"/>
+      </w:tblGrid>
+      <w:tr>
+        <w:trPr>
+          <w:tblHeader w:val="true"/>
+        </w:trPr>
+        <w:tc>
+          <w:tcPr/>
+          <w:p>
+            <w:pPr>
+              <w:pStyle w:val="Compact"/>
+              <w:jc w:val="left"/>
+            </w:pPr>
+            <w:r>
+              <w:rPr>
+                <w:bCs/>
+                <w:b/>
+              </w:rPr>
+              <w:t xml:space="preserve">Participant</w:t>
+            </w:r>
+          </w:p>
+        </w:tc>
+        <w:tc>
+          <w:tcPr/>
+          <w:p>
+            <w:pPr>
+              <w:pStyle w:val="Compact"/>
+              <w:jc w:val="left"/>
+            </w:pPr>
+            <w:r>
+              <w:rPr>
+                <w:bCs/>
+                <w:b/>
+              </w:rPr>
+              <w:t xml:space="preserve">Accuracy</w:t>
+            </w:r>
+          </w:p>
+        </w:tc>
+        <w:tc>
+          <w:tcPr/>
+          <w:p>
+            <w:pPr>
+              <w:pStyle w:val="Compact"/>
+              <w:jc w:val="left"/>
+            </w:pPr>
+            <w:r>
+              <w:rPr>
+                <w:bCs/>
+                <w:b/>
+              </w:rPr>
+              <w:t xml:space="preserve">Clarity</w:t>
+            </w:r>
+          </w:p>
+        </w:tc>
+        <w:tc>
+          <w:tcPr/>
+          <w:p>
+            <w:pPr>
+              <w:pStyle w:val="Compact"/>
+              <w:jc w:val="left"/>
+            </w:pPr>
+            <w:r>
+              <w:rPr>
+                <w:bCs/>
+                <w:b/>
+              </w:rPr>
+              <w:t xml:space="preserve">Would use again</w:t>
+            </w:r>
+          </w:p>
+        </w:tc>
+      </w:tr>
+      <w:tr>
+        <w:tc>
+          <w:tcPr/>
+          <w:p>
+            <w:pPr>
+              <w:pStyle w:val="Compact"/>
+              <w:jc w:val="left"/>
+            </w:pPr>
+            <w:r>
+              <w:t xml:space="preserve">Participant 1</w:t>
+            </w:r>
+          </w:p>
+        </w:tc>
+        <w:tc>
+          <w:tcPr/>
+          <w:p>
+            <w:pPr>
+              <w:pStyle w:val="Compact"/>
+              <w:jc w:val="left"/>
+            </w:pPr>
+            <w:r>
+              <w:t xml:space="preserve">3</w:t>
+            </w:r>
+          </w:p>
+        </w:tc>
+        <w:tc>
+          <w:tcPr/>
+          <w:p>
+            <w:pPr>
+              <w:pStyle w:val="Compact"/>
+              <w:jc w:val="left"/>
+            </w:pPr>
+            <w:r>
+              <w:t xml:space="preserve">2</w:t>
+            </w:r>
+          </w:p>
+        </w:tc>
+        <w:tc>
+          <w:tcPr/>
+          <w:p>
+            <w:pPr>
+              <w:pStyle w:val="Compact"/>
+              <w:jc w:val="left"/>
+            </w:pPr>
+            <w:r>
+              <w:t xml:space="preserve">4</w:t>
+            </w:r>
+          </w:p>
+        </w:tc>
+      </w:tr>
+      <w:tr>
+        <w:tc>
+          <w:tcPr/>
+          <w:p>
+            <w:pPr>
+              <w:pStyle w:val="Compact"/>
+              <w:jc w:val="left"/>
+            </w:pPr>
+            <w:r>
+              <w:t xml:space="preserve">Participant 2</w:t>
+            </w:r>
+          </w:p>
+        </w:tc>
+        <w:tc>
+          <w:tcPr/>
+          <w:p>
+            <w:pPr>
+              <w:pStyle w:val="Compact"/>
+              <w:jc w:val="left"/>
+            </w:pPr>
+            <w:r>
+              <w:t xml:space="preserve">4</w:t>
+            </w:r>
+          </w:p>
+        </w:tc>
+        <w:tc>
+          <w:tcPr/>
+          <w:p>
+            <w:pPr>
+              <w:pStyle w:val="Compact"/>
+              <w:jc w:val="left"/>
+            </w:pPr>
+            <w:r>
+              <w:t xml:space="preserve">5</w:t>
+            </w:r>
+          </w:p>
+        </w:tc>
+        <w:tc>
+          <w:tcPr/>
+          <w:p>
+            <w:pPr>
+              <w:pStyle w:val="Compact"/>
+              <w:jc w:val="left"/>
+            </w:pPr>
+            <w:r>
+              <w:t xml:space="preserve">5</w:t>
+            </w:r>
+          </w:p>
+        </w:tc>
+      </w:tr>
+      <w:tr>
+        <w:tc>
+          <w:tcPr/>
+          <w:p>
+            <w:pPr>
+              <w:pStyle w:val="Compact"/>
+              <w:jc w:val="left"/>
+            </w:pPr>
+            <w:r>
+              <w:t xml:space="preserve">Participant 3</w:t>
+            </w:r>
+          </w:p>
+        </w:tc>
+        <w:tc>
+          <w:tcPr/>
+          <w:p>
+            <w:pPr>
+              <w:pStyle w:val="Compact"/>
+              <w:jc w:val="left"/>
+            </w:pPr>
+            <w:r>
+              <w:t xml:space="preserve">3</w:t>
+            </w:r>
+          </w:p>
+        </w:tc>
+        <w:tc>
+          <w:tcPr/>
+          <w:p>
+            <w:pPr>
+              <w:pStyle w:val="Compact"/>
+              <w:jc w:val="left"/>
+            </w:pPr>
+            <w:r>
+              <w:t xml:space="preserve">4</w:t>
+            </w:r>
+          </w:p>
+        </w:tc>
+        <w:tc>
+          <w:tcPr/>
+          <w:p>
+            <w:pPr>
+              <w:pStyle w:val="Compact"/>
+              <w:jc w:val="left"/>
+            </w:pPr>
+            <w:r>
+              <w:t xml:space="preserve">4</w:t>
+            </w:r>
+          </w:p>
+        </w:tc>
+      </w:tr>
+      <w:tr>
+        <w:tc>
+          <w:tcPr/>
+          <w:p>
+            <w:pPr>
+              <w:pStyle w:val="Compact"/>
+              <w:jc w:val="left"/>
+            </w:pPr>
+            <w:r>
+              <w:t xml:space="preserve">Participant 4</w:t>
+            </w:r>
+          </w:p>
+        </w:tc>
+        <w:tc>
+          <w:tcPr/>
+          <w:p>
+            <w:pPr>
+              <w:pStyle w:val="Compact"/>
+              <w:jc w:val="left"/>
+            </w:pPr>
+            <w:r>
+              <w:t xml:space="preserve">2</w:t>
+            </w:r>
+          </w:p>
+        </w:tc>
+        <w:tc>
+          <w:tcPr/>
+          <w:p>
+            <w:pPr>
+              <w:pStyle w:val="Compact"/>
+              <w:jc w:val="left"/>
+            </w:pPr>
+            <w:r>
+              <w:t xml:space="preserve">3</w:t>
+            </w:r>
+          </w:p>
+        </w:tc>
+        <w:tc>
+          <w:tcPr/>
+          <w:p>
+            <w:pPr>
+              <w:pStyle w:val="Compact"/>
+              <w:jc w:val="left"/>
+            </w:pPr>
+            <w:r>
+              <w:t xml:space="preserve">3</w:t>
+            </w:r>
+          </w:p>
+        </w:tc>
+      </w:tr>
+      <w:tr>
+        <w:tc>
+          <w:tcPr/>
+          <w:p>
+            <w:pPr>
+              <w:pStyle w:val="Compact"/>
+              <w:jc w:val="left"/>
+            </w:pPr>
+            <w:r>
+              <w:t xml:space="preserve">Participant 5</w:t>
+            </w:r>
+          </w:p>
+        </w:tc>
+        <w:tc>
+          <w:tcPr/>
+          <w:p>
+            <w:pPr>
+              <w:pStyle w:val="Compact"/>
+              <w:jc w:val="left"/>
+            </w:pPr>
+            <w:r>
+              <w:t xml:space="preserve">5</w:t>
+            </w:r>
+          </w:p>
+        </w:tc>
+        <w:tc>
+          <w:tcPr/>
+          <w:p>
+            <w:pPr>
+              <w:pStyle w:val="Compact"/>
+              <w:jc w:val="left"/>
+            </w:pPr>
+            <w:r>
+              <w:t xml:space="preserve">5</w:t>
+            </w:r>
+          </w:p>
+        </w:tc>
+        <w:tc>
+          <w:tcPr/>
+          <w:p>
+            <w:pPr>
+              <w:pStyle w:val="Compact"/>
+              <w:jc w:val="left"/>
+            </w:pPr>
+            <w:r>
+              <w:t xml:space="preserve">5</w:t>
+            </w:r>
+          </w:p>
+        </w:tc>
+      </w:tr>
+      <w:tr>
+        <w:tc>
+          <w:tcPr/>
+          <w:p>
+            <w:pPr>
+              <w:pStyle w:val="Compact"/>
+              <w:jc w:val="left"/>
+            </w:pPr>
+            <w:r>
+              <w:rPr>
+                <w:bCs/>
+                <w:b/>
+              </w:rPr>
+              <w:t xml:space="preserve">Mean</w:t>
+            </w:r>
+          </w:p>
+        </w:tc>
+        <w:tc>
+          <w:tcPr/>
+          <w:p>
+            <w:pPr>
+              <w:pStyle w:val="Compact"/>
+              <w:jc w:val="left"/>
+            </w:pPr>
+            <w:r>
+              <w:rPr>
+                <w:bCs/>
+                <w:b/>
+              </w:rPr>
+              <w:t xml:space="preserve">3.4</w:t>
+            </w:r>
+          </w:p>
+        </w:tc>
+        <w:tc>
+          <w:tcPr/>
+          <w:p>
+            <w:pPr>
+              <w:pStyle w:val="Compact"/>
+              <w:jc w:val="left"/>
+            </w:pPr>
+            <w:r>
+              <w:rPr>
+                <w:bCs/>
+                <w:b/>
+              </w:rPr>
+              <w:t xml:space="preserve">3.8</w:t>
+            </w:r>
+          </w:p>
+        </w:tc>
+        <w:tc>
+          <w:tcPr/>
+          <w:p>
+            <w:pPr>
+              <w:pStyle w:val="Compact"/>
+              <w:jc w:val="left"/>
+            </w:pPr>
+            <w:r>
+              <w:rPr>
+                <w:bCs/>
+                <w:b/>
+              </w:rPr>
+              <w:t xml:space="preserve">4.2</w:t>
+            </w:r>
+          </w:p>
+        </w:tc>
+      </w:tr>
+    </w:tbl>
+    <w:p>
+      <w:pPr>
+        <w:pStyle w:val="TableCaption"/>
+      </w:pPr>
+      <w:r>
+        <w:t xml:space="preserve">Table 9. Post-session Likert scores (1-5), 5 pilot participants.</w:t>
+      </w:r>
+    </w:p>
+    <w:p>
+      <w:pPr>
+        <w:pStyle w:val="BodyText"/>
+      </w:pPr>
+      <w:r>
+        <w:t xml:space="preserve">Usefulness scored highest (4.2) and accuracy lowest (3.4), a pattern the free-text answers explain directly. Two participants reported close agreement between the profile and their actual feelings: Participant 5 wrote that their emotions were "perfectly detected, both negative and positive," and Participant 3 confirmed the profile "correctly matched how I felt." Participant 2 reported partial agreement - the profile "correctly matched my emotions especially the positive ones, but didn't quite get my fear right" - consistent with the direction-inconsistent facial-emotion misclassification already reported in Stage 1 results. Participant 1 gave the lowest clarity score (2) and the most critical comment: the profile "felt too general... it seemed like it was made to cover a large audience rather than being tailored for me," matching that participant's own session, in which the spoken answers were short and dismissive ("I just think this was a big waste of time") and the participant directly told the chat "this was not what I expected."</w:t>
+      </w:r>
+    </w:p>
+    <w:p>
+      <w:pPr>
+        <w:pStyle w:val="BodyText"/>
+      </w:pPr>
+      <w:r>
+        <w:t xml:space="preserve">One finding emerged from the session logs rather than the survey: all 5 sessions were flagged seek_help: true, despite most participants describing themselves as fine, bored, or mildly skeptical rather than genuinely distressed, and despite two participants rating the tool highly overall. This is treated as a priority finding rather than a minor detail: a severity flag that fires on every session, including ones the participant themselves rated as accurate and pleasant, suggests the threshold in ProfileGenerator's seek-help logic may be miscalibrated toward over-triggering on any ambiguous or mixed-emotion input rather than genuine distress signals. Recalibrating and re-testing this threshold against a wider range of inputs (including clearly low-distress sessions) is identified as the top priority for the September iteration, ahead of the full 6-10 person study, since a severity flag that never varies carries no diagnostic value regardless of how well it reads.</w:t>
+      </w:r>
+    </w:p>
+    <w:p>
+      <w:pPr>
+        <w:pStyle w:val="BodyText"/>
+      </w:pPr>
+      <w:r>
+        <w:t xml:space="preserve">Two further, lower-priority changes were identified from participant comments rather than from the researcher's own testing, which is the more valuable source of the two: Participant 4 suggested adding audio to the stimulus video rather than static images with text labels only, and Participant 3 suggested a longer stimulus sequence, both aimed at eliciting a stronger and more distinguishable facial-emotion signal per scene. Neither change has been implemented yet; both are recorded here as concrete, participant-sourced candidates for the design iteration between the draft and the full study, rather than being claimed as already resolved.</w:t>
+      </w:r>
+    </w:p>
     <w:bookmarkEnd w:id="58"/>
     <w:bookmarkStart w:id="59" w:name="Xda9ecb1793eab1ef851af16bbacf5e2a6b01115"/>
     <w:p>
@@ -5768,6 +6207,14 @@
       </w:pPr>
       <w:r>
         <w:t xml:space="preserve">Inclusive design and demographic limitations</w:t>
+      </w:r>
+    </w:p>
+    <w:p>
+      <w:pPr>
+        <w:pStyle w:val="FirstParagraph"/>
+      </w:pPr>
+      <w:r>
+        <w:t xml:space="preserve">Most of the benchmark and stage-level results reported in this chapter (Tables 1-8) were still produced by one user, on one machine, in English, so no claim can be made from them about accuracy across skin tones, ages, genders, accents, or non-English speech - this qualifies every accuracy figure in this chapter except Table 9. The pilot study (Table 9) widens this to 5 participants, but their age, gender, skin tone, accent and first language were not recorded as part of the protocol, so it cannot be treated as evidence of demographic robustness either - only as evidence that the system works for more than one specific person under broadly similar conditions (English speakers, webcam-equipped laptops, indoor lighting). The documented demographic bias in facial-emotion models (Buolamwini &amp; Gebru, 2018) and the accent and language variation in Whisper (Graham &amp; Roll, 2024) discussed in Design remain untested by this project rather than absent from it, and are described that way rather than as a solved problem. A 6-10 person convenience sample recruited the same way as this pilot - friends and family of the researcher - would not meaningfully close this gap either, since a convenience sample skews toward people demographically similar to the researcher; addressing it properly would require deliberate recruitment across skin tone, accent and age as explicit sampling criteria, which is outside the scope available to a single-person student project on this timeline. Stating this limit is treated as critical evaluation rather than as a weakness to minimise, and this section doubles as preparation for exam Q2b/c.</w:t>
       </w:r>
     </w:p>
     <w:bookmarkEnd w:id="59"/>

</xml_diff>